<commit_message>
Save changes on document
2.4 Saved "Hello" to document
</commit_message>
<xml_diff>
--- a/InstallationDocument.docx
+++ b/InstallationDocument.docx
@@ -33,6 +33,16 @@
           <w:bCs/>
           <w:sz w:val="36"/>
           <w:szCs w:val="36"/>
+        </w:rPr>
+      </w:r>
+      <w:r>
+        <w:rPr>
+          <w:b/>
+          <w:bCs/>
+          <w:sz w:val="36"/>
+          <w:szCs w:val="36"/>
+          <w:highlight w:val="none"/>
+          <w:lang w:val="en-US"/>
         </w:rPr>
       </w:r>
     </w:p>
@@ -106,30 +116,8 @@
           <w:bCs w:val="0"/>
           <w:sz w:val="28"/>
           <w:szCs w:val="28"/>
-        </w:rPr>
-      </w:r>
-      <w:r>
-        <w:rPr>
-          <w:b w:val="0"/>
-          <w:bCs w:val="0"/>
-          <w:sz w:val="28"/>
-          <w:szCs w:val="28"/>
-        </w:rPr>
-      </w:r>
-      <w:r>
-        <w:rPr>
-          <w:b w:val="0"/>
-          <w:bCs w:val="0"/>
-          <w:sz w:val="28"/>
-          <w:szCs w:val="28"/>
-        </w:rPr>
-      </w:r>
-      <w:r>
-        <w:rPr>
-          <w:b w:val="0"/>
-          <w:bCs w:val="0"/>
-          <w:sz w:val="28"/>
-          <w:szCs w:val="28"/>
+          <w:highlight w:val="none"/>
+          <w:lang w:val="en-US"/>
         </w:rPr>
       </w:r>
       <w:r>
@@ -178,7 +166,7 @@
           <w:highlight w:val="none"/>
           <w:lang w:val="en-US"/>
         </w:rPr>
-        <w:t xml:space="preserve"> I will use Bazaar for the instructions. Once I am in Bazaar, I will search for Github. As these are community forks of desktop application there are a few options. I will use the normal GitHub Desktop. I click “Get”, then choose if I want it for all users, or just my user. </w:t>
+        <w:t xml:space="preserve"> I will use Bazaar </w:t>
       </w:r>
       <w:r>
         <w:rPr>
@@ -186,6 +174,27 @@
           <w:bCs w:val="0"/>
           <w:sz w:val="28"/>
           <w:szCs w:val="28"/>
+          <w:highlight w:val="none"/>
+          <w:lang w:val="en-US"/>
+        </w:rPr>
+        <w:t xml:space="preserve">for the instructions. Once I am in Bazaar, I will search for Github. As these are community forks of desktop application there are a few options. I will use the normal GitHub Desktop. I click “Get”, then choose if I want it for all users, or just my user. </w:t>
+      </w:r>
+      <w:r>
+        <w:rPr>
+          <w:b w:val="0"/>
+          <w:bCs w:val="0"/>
+          <w:sz w:val="28"/>
+          <w:szCs w:val="28"/>
+        </w:rPr>
+      </w:r>
+      <w:r>
+        <w:rPr>
+          <w:b w:val="0"/>
+          <w:bCs w:val="0"/>
+          <w:sz w:val="28"/>
+          <w:szCs w:val="28"/>
+          <w:highlight w:val="none"/>
+          <w:lang w:val="en-US"/>
         </w:rPr>
       </w:r>
     </w:p>
@@ -239,7 +248,7 @@
       <w:hyperlink r:id="rId8" w:tooltip="https://desktop.github.com/download/" w:history="1">
         <w:r>
           <w:rPr>
-            <w:rStyle w:val="187"/>
+            <w:rStyle w:val="872"/>
             <w:b w:val="0"/>
             <w:bCs w:val="0"/>
             <w:sz w:val="28"/>
@@ -251,7 +260,7 @@
         </w:r>
         <w:r>
           <w:rPr>
-            <w:rStyle w:val="187"/>
+            <w:rStyle w:val="872"/>
             <w:b w:val="0"/>
             <w:bCs w:val="0"/>
             <w:sz w:val="28"/>
@@ -296,20 +305,10 @@
           <w:lang w:val="en-US"/>
         </w:rPr>
       </w:r>
-      <w:r>
-        <w:rPr>
-          <w:b w:val="0"/>
-          <w:bCs w:val="0"/>
-          <w:sz w:val="28"/>
-          <w:szCs w:val="28"/>
-          <w:highlight w:val="none"/>
-          <w:lang w:val="en-US"/>
-        </w:rPr>
-      </w:r>
       <w:hyperlink r:id="rId9" w:tooltip="https://github.com/." w:history="1">
         <w:r>
           <w:rPr>
-            <w:rStyle w:val="187"/>
+            <w:rStyle w:val="872"/>
             <w:b w:val="0"/>
             <w:bCs w:val="0"/>
             <w:sz w:val="28"/>
@@ -321,7 +320,7 @@
         </w:r>
         <w:r>
           <w:rPr>
-            <w:rStyle w:val="187"/>
+            <w:rStyle w:val="872"/>
             <w:b w:val="0"/>
             <w:bCs w:val="0"/>
             <w:sz w:val="28"/>
@@ -341,10 +340,7 @@
           <w:highlight w:val="none"/>
           <w:lang w:val="en-US"/>
         </w:rPr>
-        <w:t xml:space="preserve"> Then click the Sign Up Button, Once accessed you will have options to enter email, password, username and select your country. Or you can sign up with Google or Apple accounts.</w:t>
-        <w:br/>
-        <w:br/>
-        <w:t xml:space="preserve">After you have created your account, go to the desktop application and log in through there. It should launch the web browser on GitHub and ask for the sign in information if you are already not signed in. After signing in you will be prompted with a screen to authorise the GitHub Desktop Application. Click continue, then you may get a browser prompt to let the site open the application, click open. Then you will be taken back to the application and signed in ready to configure.</w:t>
+        <w:t xml:space="preserve"> Then click the Sign Up Button, Once accessed you will have options to enter email, password, username and select your country. Or you can sign up wit</w:t>
       </w:r>
       <w:r>
         <w:rPr>
@@ -352,6 +348,41 @@
           <w:bCs w:val="0"/>
           <w:sz w:val="28"/>
           <w:szCs w:val="28"/>
+          <w:highlight w:val="none"/>
+          <w:lang w:val="en-US"/>
+        </w:rPr>
+        <w:t xml:space="preserve">h Google or Apple accounts.</w:t>
+        <w:br/>
+        <w:br/>
+        <w:t xml:space="preserve">After you have created your account, go to the desktop application and log in through there. It should launch the web browser on GitHub and ask for the sign in information if you are already not signed in. After signing in you </w:t>
+      </w:r>
+      <w:r>
+        <w:rPr>
+          <w:b w:val="0"/>
+          <w:bCs w:val="0"/>
+          <w:sz w:val="28"/>
+          <w:szCs w:val="28"/>
+          <w:highlight w:val="none"/>
+          <w:lang w:val="en-US"/>
+        </w:rPr>
+        <w:t xml:space="preserve">will be prompted with a screen to authorise the GitHub Desktop Application. Click continue, then you may get a browser prompt to let the site open the application, click open. Then you will be taken back to the application and signed in ready to configure.</w:t>
+      </w:r>
+      <w:r>
+        <w:rPr>
+          <w:b w:val="0"/>
+          <w:bCs w:val="0"/>
+          <w:sz w:val="28"/>
+          <w:szCs w:val="28"/>
+        </w:rPr>
+      </w:r>
+      <w:r>
+        <w:rPr>
+          <w:b w:val="0"/>
+          <w:bCs w:val="0"/>
+          <w:sz w:val="28"/>
+          <w:szCs w:val="28"/>
+          <w:highlight w:val="none"/>
+          <w:lang w:val="en-US"/>
         </w:rPr>
       </w:r>
     </w:p>
@@ -413,6 +444,16 @@
           <w:szCs w:val="28"/>
         </w:rPr>
       </w:r>
+      <w:r>
+        <w:rPr>
+          <w:b w:val="0"/>
+          <w:bCs w:val="0"/>
+          <w:sz w:val="28"/>
+          <w:szCs w:val="28"/>
+          <w:highlight w:val="none"/>
+          <w:lang w:val="en-US"/>
+        </w:rPr>
+      </w:r>
     </w:p>
     <w:p>
       <w:pPr>
@@ -446,6 +487,7 @@
           <w:highlight w:val="none"/>
           <w:lang w:val="en-US"/>
         </w:rPr>
+        <w:t xml:space="preserve">Hello</w:t>
       </w:r>
       <w:r>
         <w:rPr>
@@ -453,8 +495,6 @@
           <w:bCs w:val="0"/>
           <w:sz w:val="28"/>
           <w:szCs w:val="28"/>
-          <w:highlight w:val="none"/>
-          <w:lang w:val="en-US"/>
         </w:rPr>
       </w:r>
     </w:p>
@@ -480,7 +520,6 @@
         <w:ind/>
         <w:rPr/>
       </w:pPr>
-      <w:r/>
       <w:r>
         <w:separator/>
       </w:r>
@@ -495,7 +534,6 @@
         <w:ind/>
         <w:rPr/>
       </w:pPr>
-      <w:r/>
       <w:r>
         <w:continuationSeparator/>
       </w:r>
@@ -515,7 +553,6 @@
         <w:ind/>
         <w:rPr/>
       </w:pPr>
-      <w:r/>
       <w:r>
         <w:separator/>
       </w:r>
@@ -530,7 +567,6 @@
         <w:ind/>
         <w:rPr/>
       </w:pPr>
-      <w:r/>
       <w:r>
         <w:continuationSeparator/>
       </w:r>
@@ -698,9 +734,9 @@
     <w:lsdException w:name="Bibliography" w:uiPriority="37"/>
     <w:lsdException w:name="TOC Heading" w:uiPriority="39" w:qFormat="1"/>
   </w:latentStyles>
-  <w:style w:type="table" w:styleId="12">
+  <w:style w:type="table" w:styleId="701">
     <w:name w:val="Table Grid"/>
-    <w:basedOn w:val="665"/>
+    <w:basedOn w:val="887"/>
     <w:uiPriority w:val="59"/>
     <w:pPr>
       <w:pBdr/>
@@ -897,9 +933,9 @@
       </w:tcPr>
     </w:tblStylePr>
   </w:style>
-  <w:style w:type="table" w:styleId="13">
+  <w:style w:type="table" w:styleId="702">
     <w:name w:val="Table Grid Light"/>
-    <w:basedOn w:val="665"/>
+    <w:basedOn w:val="887"/>
     <w:uiPriority w:val="59"/>
     <w:pPr>
       <w:pBdr/>
@@ -1096,9 +1132,9 @@
       </w:tcPr>
     </w:tblStylePr>
   </w:style>
-  <w:style w:type="table" w:styleId="14">
+  <w:style w:type="table" w:styleId="703">
     <w:name w:val="Plain Table 1"/>
-    <w:basedOn w:val="665"/>
+    <w:basedOn w:val="887"/>
     <w:uiPriority w:val="59"/>
     <w:pPr>
       <w:pBdr/>
@@ -1321,9 +1357,9 @@
       </w:tcPr>
     </w:tblStylePr>
   </w:style>
-  <w:style w:type="table" w:styleId="15">
+  <w:style w:type="table" w:styleId="704">
     <w:name w:val="Plain Table 2"/>
-    <w:basedOn w:val="665"/>
+    <w:basedOn w:val="887"/>
     <w:uiPriority w:val="59"/>
     <w:pPr>
       <w:pBdr/>
@@ -1554,9 +1590,9 @@
       </w:tcPr>
     </w:tblStylePr>
   </w:style>
-  <w:style w:type="table" w:styleId="16">
+  <w:style w:type="table" w:styleId="705">
     <w:name w:val="Plain Table 3"/>
-    <w:basedOn w:val="665"/>
+    <w:basedOn w:val="887"/>
     <w:uiPriority w:val="99"/>
     <w:pPr>
       <w:pBdr/>
@@ -1784,9 +1820,9 @@
       </w:tcPr>
     </w:tblStylePr>
   </w:style>
-  <w:style w:type="table" w:styleId="17">
+  <w:style w:type="table" w:styleId="706">
     <w:name w:val="Plain Table 4"/>
-    <w:basedOn w:val="665"/>
+    <w:basedOn w:val="887"/>
     <w:uiPriority w:val="99"/>
     <w:pPr>
       <w:pBdr/>
@@ -2000,9 +2036,9 @@
       </w:tcPr>
     </w:tblStylePr>
   </w:style>
-  <w:style w:type="table" w:styleId="18">
+  <w:style w:type="table" w:styleId="707">
     <w:name w:val="Plain Table 5"/>
-    <w:basedOn w:val="665"/>
+    <w:basedOn w:val="887"/>
     <w:uiPriority w:val="99"/>
     <w:pPr>
       <w:pBdr/>
@@ -2233,9 +2269,9 @@
       </w:tcPr>
     </w:tblStylePr>
   </w:style>
-  <w:style w:type="table" w:styleId="19">
+  <w:style w:type="table" w:styleId="708">
     <w:name w:val="Grid Table 1 Light"/>
-    <w:basedOn w:val="665"/>
+    <w:basedOn w:val="887"/>
     <w:uiPriority w:val="99"/>
     <w:pPr>
       <w:pBdr/>
@@ -2456,9 +2492,9 @@
       </w:tcPr>
     </w:tblStylePr>
   </w:style>
-  <w:style w:type="table" w:styleId="20">
+  <w:style w:type="table" w:styleId="709">
     <w:name w:val="Grid Table 1 Light - Accent 1"/>
-    <w:basedOn w:val="665"/>
+    <w:basedOn w:val="887"/>
     <w:uiPriority w:val="99"/>
     <w:pPr>
       <w:pBdr/>
@@ -2679,9 +2715,9 @@
       </w:tcPr>
     </w:tblStylePr>
   </w:style>
-  <w:style w:type="table" w:styleId="21">
+  <w:style w:type="table" w:styleId="710">
     <w:name w:val="Grid Table 1 Light - Accent 2"/>
-    <w:basedOn w:val="665"/>
+    <w:basedOn w:val="887"/>
     <w:uiPriority w:val="99"/>
     <w:pPr>
       <w:pBdr/>
@@ -2902,9 +2938,9 @@
       </w:tcPr>
     </w:tblStylePr>
   </w:style>
-  <w:style w:type="table" w:styleId="22">
+  <w:style w:type="table" w:styleId="711">
     <w:name w:val="Grid Table 1 Light - Accent 3"/>
-    <w:basedOn w:val="665"/>
+    <w:basedOn w:val="887"/>
     <w:uiPriority w:val="99"/>
     <w:pPr>
       <w:pBdr/>
@@ -3125,9 +3161,9 @@
       </w:tcPr>
     </w:tblStylePr>
   </w:style>
-  <w:style w:type="table" w:styleId="23">
+  <w:style w:type="table" w:styleId="712">
     <w:name w:val="Grid Table 1 Light - Accent 4"/>
-    <w:basedOn w:val="665"/>
+    <w:basedOn w:val="887"/>
     <w:uiPriority w:val="99"/>
     <w:pPr>
       <w:pBdr/>
@@ -3348,9 +3384,9 @@
       </w:tcPr>
     </w:tblStylePr>
   </w:style>
-  <w:style w:type="table" w:styleId="24">
+  <w:style w:type="table" w:styleId="713">
     <w:name w:val="Grid Table 1 Light - Accent 5"/>
-    <w:basedOn w:val="665"/>
+    <w:basedOn w:val="887"/>
     <w:uiPriority w:val="99"/>
     <w:pPr>
       <w:pBdr/>
@@ -3571,9 +3607,9 @@
       </w:tcPr>
     </w:tblStylePr>
   </w:style>
-  <w:style w:type="table" w:styleId="25">
+  <w:style w:type="table" w:styleId="714">
     <w:name w:val="Grid Table 1 Light - Accent 6"/>
-    <w:basedOn w:val="665"/>
+    <w:basedOn w:val="887"/>
     <w:uiPriority w:val="99"/>
     <w:pPr>
       <w:pBdr/>
@@ -3794,9 +3830,9 @@
       </w:tcPr>
     </w:tblStylePr>
   </w:style>
-  <w:style w:type="table" w:styleId="26">
+  <w:style w:type="table" w:styleId="715">
     <w:name w:val="Grid Table 2"/>
-    <w:basedOn w:val="665"/>
+    <w:basedOn w:val="887"/>
     <w:uiPriority w:val="99"/>
     <w:pPr>
       <w:pBdr/>
@@ -4026,9 +4062,9 @@
       </w:tcPr>
     </w:tblStylePr>
   </w:style>
-  <w:style w:type="table" w:styleId="27">
+  <w:style w:type="table" w:styleId="716">
     <w:name w:val="Grid Table 2 - Accent 1"/>
-    <w:basedOn w:val="665"/>
+    <w:basedOn w:val="887"/>
     <w:uiPriority w:val="99"/>
     <w:pPr>
       <w:pBdr/>
@@ -4258,9 +4294,9 @@
       </w:tcPr>
     </w:tblStylePr>
   </w:style>
-  <w:style w:type="table" w:styleId="28">
+  <w:style w:type="table" w:styleId="717">
     <w:name w:val="Grid Table 2 - Accent 2"/>
-    <w:basedOn w:val="665"/>
+    <w:basedOn w:val="887"/>
     <w:uiPriority w:val="99"/>
     <w:pPr>
       <w:pBdr/>
@@ -4490,9 +4526,9 @@
       </w:tcPr>
     </w:tblStylePr>
   </w:style>
-  <w:style w:type="table" w:styleId="29">
+  <w:style w:type="table" w:styleId="718">
     <w:name w:val="Grid Table 2 - Accent 3"/>
-    <w:basedOn w:val="665"/>
+    <w:basedOn w:val="887"/>
     <w:uiPriority w:val="99"/>
     <w:pPr>
       <w:pBdr/>
@@ -4722,9 +4758,9 @@
       </w:tcPr>
     </w:tblStylePr>
   </w:style>
-  <w:style w:type="table" w:styleId="30">
+  <w:style w:type="table" w:styleId="719">
     <w:name w:val="Grid Table 2 - Accent 4"/>
-    <w:basedOn w:val="665"/>
+    <w:basedOn w:val="887"/>
     <w:uiPriority w:val="99"/>
     <w:pPr>
       <w:pBdr/>
@@ -4954,9 +4990,9 @@
       </w:tcPr>
     </w:tblStylePr>
   </w:style>
-  <w:style w:type="table" w:styleId="31">
+  <w:style w:type="table" w:styleId="720">
     <w:name w:val="Grid Table 2 - Accent 5"/>
-    <w:basedOn w:val="665"/>
+    <w:basedOn w:val="887"/>
     <w:uiPriority w:val="99"/>
     <w:pPr>
       <w:pBdr/>
@@ -5186,9 +5222,9 @@
       </w:tcPr>
     </w:tblStylePr>
   </w:style>
-  <w:style w:type="table" w:styleId="32">
+  <w:style w:type="table" w:styleId="721">
     <w:name w:val="Grid Table 2 - Accent 6"/>
-    <w:basedOn w:val="665"/>
+    <w:basedOn w:val="887"/>
     <w:uiPriority w:val="99"/>
     <w:pPr>
       <w:pBdr/>
@@ -5418,9 +5454,9 @@
       </w:tcPr>
     </w:tblStylePr>
   </w:style>
-  <w:style w:type="table" w:styleId="33">
+  <w:style w:type="table" w:styleId="722">
     <w:name w:val="Grid Table 3"/>
-    <w:basedOn w:val="665"/>
+    <w:basedOn w:val="887"/>
     <w:uiPriority w:val="99"/>
     <w:pPr>
       <w:pBdr/>
@@ -5519,29 +5555,6 @@
         <w:tblBorders/>
       </w:tblPr>
       <w:tcPr>
-        <w:shd w:color="ffffff"/>
-        <w:tcBorders>
-          <w:top w:val="none" w:color="000000" w:sz="4" w:space="0"/>
-          <w:left w:val="none" w:color="000000" w:sz="4" w:space="0"/>
-          <w:bottom w:val="none" w:color="000000" w:sz="4" w:space="0"/>
-          <w:right w:val="none" w:color="000000" w:sz="4" w:space="0"/>
-        </w:tcBorders>
-      </w:tcPr>
-    </w:tblStylePr>
-    <w:tblStylePr w:type="firstRow">
-      <w:rPr>
-        <w:b/>
-        <w:color w:val="404040"/>
-      </w:rPr>
-      <w:pPr>
-        <w:pBdr/>
-        <w:spacing/>
-        <w:ind/>
-      </w:pPr>
-      <w:tblPr>
-        <w:tblBorders/>
-      </w:tblPr>
-      <w:tcPr>
         <w:shd w:val="clear" w:color="ffffff"/>
         <w:tcBorders>
           <w:top w:val="none" w:color="000000" w:sz="4" w:space="0"/>
@@ -5551,30 +5564,7 @@
         </w:tcBorders>
       </w:tcPr>
     </w:tblStylePr>
-    <w:tblStylePr w:type="lastCol">
-      <w:rPr>
-        <w:i/>
-        <w:color w:val="404040"/>
-      </w:rPr>
-      <w:pPr>
-        <w:pBdr/>
-        <w:spacing/>
-        <w:ind/>
-      </w:pPr>
-      <w:tblPr>
-        <w:tblBorders/>
-      </w:tblPr>
-      <w:tcPr>
-        <w:shd w:color="ffffff"/>
-        <w:tcBorders>
-          <w:top w:val="none" w:color="000000" w:sz="4" w:space="0"/>
-          <w:left w:val="none" w:color="000000" w:sz="4" w:space="0"/>
-          <w:bottom w:val="none" w:color="000000" w:sz="4" w:space="0"/>
-          <w:right w:val="none" w:color="000000" w:sz="4" w:space="0"/>
-        </w:tcBorders>
-      </w:tcPr>
-    </w:tblStylePr>
-    <w:tblStylePr w:type="lastRow">
+    <w:tblStylePr w:type="firstRow">
       <w:rPr>
         <w:b/>
         <w:color w:val="404040"/>
@@ -5597,6 +5587,52 @@
         </w:tcBorders>
       </w:tcPr>
     </w:tblStylePr>
+    <w:tblStylePr w:type="lastCol">
+      <w:rPr>
+        <w:i/>
+        <w:color w:val="404040"/>
+      </w:rPr>
+      <w:pPr>
+        <w:pBdr/>
+        <w:spacing/>
+        <w:ind/>
+      </w:pPr>
+      <w:tblPr>
+        <w:tblBorders/>
+      </w:tblPr>
+      <w:tcPr>
+        <w:shd w:val="clear" w:color="ffffff"/>
+        <w:tcBorders>
+          <w:top w:val="none" w:color="000000" w:sz="4" w:space="0"/>
+          <w:left w:val="none" w:color="000000" w:sz="4" w:space="0"/>
+          <w:bottom w:val="none" w:color="000000" w:sz="4" w:space="0"/>
+          <w:right w:val="none" w:color="000000" w:sz="4" w:space="0"/>
+        </w:tcBorders>
+      </w:tcPr>
+    </w:tblStylePr>
+    <w:tblStylePr w:type="lastRow">
+      <w:rPr>
+        <w:b/>
+        <w:color w:val="404040"/>
+      </w:rPr>
+      <w:pPr>
+        <w:pBdr/>
+        <w:spacing/>
+        <w:ind/>
+      </w:pPr>
+      <w:tblPr>
+        <w:tblBorders/>
+      </w:tblPr>
+      <w:tcPr>
+        <w:shd w:val="clear" w:color="ffffff"/>
+        <w:tcBorders>
+          <w:top w:val="none" w:color="000000" w:sz="4" w:space="0"/>
+          <w:left w:val="none" w:color="000000" w:sz="4" w:space="0"/>
+          <w:bottom w:val="none" w:color="000000" w:sz="4" w:space="0"/>
+          <w:right w:val="none" w:color="000000" w:sz="4" w:space="0"/>
+        </w:tcBorders>
+      </w:tcPr>
+    </w:tblStylePr>
     <w:tblStylePr w:type="nwCell">
       <w:pPr>
         <w:pBdr/>
@@ -5663,9 +5699,9 @@
       </w:tcPr>
     </w:tblStylePr>
   </w:style>
-  <w:style w:type="table" w:styleId="34">
+  <w:style w:type="table" w:styleId="723">
     <w:name w:val="Grid Table 3 - Accent 1"/>
-    <w:basedOn w:val="665"/>
+    <w:basedOn w:val="887"/>
     <w:uiPriority w:val="99"/>
     <w:pPr>
       <w:pBdr/>
@@ -5764,29 +5800,6 @@
         <w:tblBorders/>
       </w:tblPr>
       <w:tcPr>
-        <w:shd w:color="ffffff"/>
-        <w:tcBorders>
-          <w:top w:val="none" w:color="000000" w:sz="4" w:space="0"/>
-          <w:left w:val="none" w:color="000000" w:sz="4" w:space="0"/>
-          <w:bottom w:val="none" w:color="000000" w:sz="4" w:space="0"/>
-          <w:right w:val="none" w:color="000000" w:sz="4" w:space="0"/>
-        </w:tcBorders>
-      </w:tcPr>
-    </w:tblStylePr>
-    <w:tblStylePr w:type="firstRow">
-      <w:rPr>
-        <w:b/>
-        <w:color w:val="404040"/>
-      </w:rPr>
-      <w:pPr>
-        <w:pBdr/>
-        <w:spacing/>
-        <w:ind/>
-      </w:pPr>
-      <w:tblPr>
-        <w:tblBorders/>
-      </w:tblPr>
-      <w:tcPr>
         <w:shd w:val="clear" w:color="ffffff"/>
         <w:tcBorders>
           <w:top w:val="none" w:color="000000" w:sz="4" w:space="0"/>
@@ -5796,30 +5809,7 @@
         </w:tcBorders>
       </w:tcPr>
     </w:tblStylePr>
-    <w:tblStylePr w:type="lastCol">
-      <w:rPr>
-        <w:i/>
-        <w:color w:val="404040"/>
-      </w:rPr>
-      <w:pPr>
-        <w:pBdr/>
-        <w:spacing/>
-        <w:ind/>
-      </w:pPr>
-      <w:tblPr>
-        <w:tblBorders/>
-      </w:tblPr>
-      <w:tcPr>
-        <w:shd w:color="ffffff"/>
-        <w:tcBorders>
-          <w:top w:val="none" w:color="000000" w:sz="4" w:space="0"/>
-          <w:left w:val="none" w:color="000000" w:sz="4" w:space="0"/>
-          <w:bottom w:val="none" w:color="000000" w:sz="4" w:space="0"/>
-          <w:right w:val="none" w:color="000000" w:sz="4" w:space="0"/>
-        </w:tcBorders>
-      </w:tcPr>
-    </w:tblStylePr>
-    <w:tblStylePr w:type="lastRow">
+    <w:tblStylePr w:type="firstRow">
       <w:rPr>
         <w:b/>
         <w:color w:val="404040"/>
@@ -5842,6 +5832,52 @@
         </w:tcBorders>
       </w:tcPr>
     </w:tblStylePr>
+    <w:tblStylePr w:type="lastCol">
+      <w:rPr>
+        <w:i/>
+        <w:color w:val="404040"/>
+      </w:rPr>
+      <w:pPr>
+        <w:pBdr/>
+        <w:spacing/>
+        <w:ind/>
+      </w:pPr>
+      <w:tblPr>
+        <w:tblBorders/>
+      </w:tblPr>
+      <w:tcPr>
+        <w:shd w:val="clear" w:color="ffffff"/>
+        <w:tcBorders>
+          <w:top w:val="none" w:color="000000" w:sz="4" w:space="0"/>
+          <w:left w:val="none" w:color="000000" w:sz="4" w:space="0"/>
+          <w:bottom w:val="none" w:color="000000" w:sz="4" w:space="0"/>
+          <w:right w:val="none" w:color="000000" w:sz="4" w:space="0"/>
+        </w:tcBorders>
+      </w:tcPr>
+    </w:tblStylePr>
+    <w:tblStylePr w:type="lastRow">
+      <w:rPr>
+        <w:b/>
+        <w:color w:val="404040"/>
+      </w:rPr>
+      <w:pPr>
+        <w:pBdr/>
+        <w:spacing/>
+        <w:ind/>
+      </w:pPr>
+      <w:tblPr>
+        <w:tblBorders/>
+      </w:tblPr>
+      <w:tcPr>
+        <w:shd w:val="clear" w:color="ffffff"/>
+        <w:tcBorders>
+          <w:top w:val="none" w:color="000000" w:sz="4" w:space="0"/>
+          <w:left w:val="none" w:color="000000" w:sz="4" w:space="0"/>
+          <w:bottom w:val="none" w:color="000000" w:sz="4" w:space="0"/>
+          <w:right w:val="none" w:color="000000" w:sz="4" w:space="0"/>
+        </w:tcBorders>
+      </w:tcPr>
+    </w:tblStylePr>
     <w:tblStylePr w:type="nwCell">
       <w:pPr>
         <w:pBdr/>
@@ -5908,9 +5944,9 @@
       </w:tcPr>
     </w:tblStylePr>
   </w:style>
-  <w:style w:type="table" w:styleId="35">
+  <w:style w:type="table" w:styleId="724">
     <w:name w:val="Grid Table 3 - Accent 2"/>
-    <w:basedOn w:val="665"/>
+    <w:basedOn w:val="887"/>
     <w:uiPriority w:val="99"/>
     <w:pPr>
       <w:pBdr/>
@@ -6009,29 +6045,6 @@
         <w:tblBorders/>
       </w:tblPr>
       <w:tcPr>
-        <w:shd w:color="ffffff"/>
-        <w:tcBorders>
-          <w:top w:val="none" w:color="000000" w:sz="4" w:space="0"/>
-          <w:left w:val="none" w:color="000000" w:sz="4" w:space="0"/>
-          <w:bottom w:val="none" w:color="000000" w:sz="4" w:space="0"/>
-          <w:right w:val="none" w:color="000000" w:sz="4" w:space="0"/>
-        </w:tcBorders>
-      </w:tcPr>
-    </w:tblStylePr>
-    <w:tblStylePr w:type="firstRow">
-      <w:rPr>
-        <w:b/>
-        <w:color w:val="404040"/>
-      </w:rPr>
-      <w:pPr>
-        <w:pBdr/>
-        <w:spacing/>
-        <w:ind/>
-      </w:pPr>
-      <w:tblPr>
-        <w:tblBorders/>
-      </w:tblPr>
-      <w:tcPr>
         <w:shd w:val="clear" w:color="ffffff"/>
         <w:tcBorders>
           <w:top w:val="none" w:color="000000" w:sz="4" w:space="0"/>
@@ -6041,30 +6054,7 @@
         </w:tcBorders>
       </w:tcPr>
     </w:tblStylePr>
-    <w:tblStylePr w:type="lastCol">
-      <w:rPr>
-        <w:i/>
-        <w:color w:val="404040"/>
-      </w:rPr>
-      <w:pPr>
-        <w:pBdr/>
-        <w:spacing/>
-        <w:ind/>
-      </w:pPr>
-      <w:tblPr>
-        <w:tblBorders/>
-      </w:tblPr>
-      <w:tcPr>
-        <w:shd w:color="ffffff"/>
-        <w:tcBorders>
-          <w:top w:val="none" w:color="000000" w:sz="4" w:space="0"/>
-          <w:left w:val="none" w:color="000000" w:sz="4" w:space="0"/>
-          <w:bottom w:val="none" w:color="000000" w:sz="4" w:space="0"/>
-          <w:right w:val="none" w:color="000000" w:sz="4" w:space="0"/>
-        </w:tcBorders>
-      </w:tcPr>
-    </w:tblStylePr>
-    <w:tblStylePr w:type="lastRow">
+    <w:tblStylePr w:type="firstRow">
       <w:rPr>
         <w:b/>
         <w:color w:val="404040"/>
@@ -6087,6 +6077,52 @@
         </w:tcBorders>
       </w:tcPr>
     </w:tblStylePr>
+    <w:tblStylePr w:type="lastCol">
+      <w:rPr>
+        <w:i/>
+        <w:color w:val="404040"/>
+      </w:rPr>
+      <w:pPr>
+        <w:pBdr/>
+        <w:spacing/>
+        <w:ind/>
+      </w:pPr>
+      <w:tblPr>
+        <w:tblBorders/>
+      </w:tblPr>
+      <w:tcPr>
+        <w:shd w:val="clear" w:color="ffffff"/>
+        <w:tcBorders>
+          <w:top w:val="none" w:color="000000" w:sz="4" w:space="0"/>
+          <w:left w:val="none" w:color="000000" w:sz="4" w:space="0"/>
+          <w:bottom w:val="none" w:color="000000" w:sz="4" w:space="0"/>
+          <w:right w:val="none" w:color="000000" w:sz="4" w:space="0"/>
+        </w:tcBorders>
+      </w:tcPr>
+    </w:tblStylePr>
+    <w:tblStylePr w:type="lastRow">
+      <w:rPr>
+        <w:b/>
+        <w:color w:val="404040"/>
+      </w:rPr>
+      <w:pPr>
+        <w:pBdr/>
+        <w:spacing/>
+        <w:ind/>
+      </w:pPr>
+      <w:tblPr>
+        <w:tblBorders/>
+      </w:tblPr>
+      <w:tcPr>
+        <w:shd w:val="clear" w:color="ffffff"/>
+        <w:tcBorders>
+          <w:top w:val="none" w:color="000000" w:sz="4" w:space="0"/>
+          <w:left w:val="none" w:color="000000" w:sz="4" w:space="0"/>
+          <w:bottom w:val="none" w:color="000000" w:sz="4" w:space="0"/>
+          <w:right w:val="none" w:color="000000" w:sz="4" w:space="0"/>
+        </w:tcBorders>
+      </w:tcPr>
+    </w:tblStylePr>
     <w:tblStylePr w:type="nwCell">
       <w:pPr>
         <w:pBdr/>
@@ -6153,9 +6189,9 @@
       </w:tcPr>
     </w:tblStylePr>
   </w:style>
-  <w:style w:type="table" w:styleId="36">
+  <w:style w:type="table" w:styleId="725">
     <w:name w:val="Grid Table 3 - Accent 3"/>
-    <w:basedOn w:val="665"/>
+    <w:basedOn w:val="887"/>
     <w:uiPriority w:val="99"/>
     <w:pPr>
       <w:pBdr/>
@@ -6254,29 +6290,6 @@
         <w:tblBorders/>
       </w:tblPr>
       <w:tcPr>
-        <w:shd w:color="ffffff"/>
-        <w:tcBorders>
-          <w:top w:val="none" w:color="000000" w:sz="4" w:space="0"/>
-          <w:left w:val="none" w:color="000000" w:sz="4" w:space="0"/>
-          <w:bottom w:val="none" w:color="000000" w:sz="4" w:space="0"/>
-          <w:right w:val="none" w:color="000000" w:sz="4" w:space="0"/>
-        </w:tcBorders>
-      </w:tcPr>
-    </w:tblStylePr>
-    <w:tblStylePr w:type="firstRow">
-      <w:rPr>
-        <w:b/>
-        <w:color w:val="404040"/>
-      </w:rPr>
-      <w:pPr>
-        <w:pBdr/>
-        <w:spacing/>
-        <w:ind/>
-      </w:pPr>
-      <w:tblPr>
-        <w:tblBorders/>
-      </w:tblPr>
-      <w:tcPr>
         <w:shd w:val="clear" w:color="ffffff"/>
         <w:tcBorders>
           <w:top w:val="none" w:color="000000" w:sz="4" w:space="0"/>
@@ -6286,30 +6299,7 @@
         </w:tcBorders>
       </w:tcPr>
     </w:tblStylePr>
-    <w:tblStylePr w:type="lastCol">
-      <w:rPr>
-        <w:i/>
-        <w:color w:val="404040"/>
-      </w:rPr>
-      <w:pPr>
-        <w:pBdr/>
-        <w:spacing/>
-        <w:ind/>
-      </w:pPr>
-      <w:tblPr>
-        <w:tblBorders/>
-      </w:tblPr>
-      <w:tcPr>
-        <w:shd w:color="ffffff"/>
-        <w:tcBorders>
-          <w:top w:val="none" w:color="000000" w:sz="4" w:space="0"/>
-          <w:left w:val="none" w:color="000000" w:sz="4" w:space="0"/>
-          <w:bottom w:val="none" w:color="000000" w:sz="4" w:space="0"/>
-          <w:right w:val="none" w:color="000000" w:sz="4" w:space="0"/>
-        </w:tcBorders>
-      </w:tcPr>
-    </w:tblStylePr>
-    <w:tblStylePr w:type="lastRow">
+    <w:tblStylePr w:type="firstRow">
       <w:rPr>
         <w:b/>
         <w:color w:val="404040"/>
@@ -6332,6 +6322,52 @@
         </w:tcBorders>
       </w:tcPr>
     </w:tblStylePr>
+    <w:tblStylePr w:type="lastCol">
+      <w:rPr>
+        <w:i/>
+        <w:color w:val="404040"/>
+      </w:rPr>
+      <w:pPr>
+        <w:pBdr/>
+        <w:spacing/>
+        <w:ind/>
+      </w:pPr>
+      <w:tblPr>
+        <w:tblBorders/>
+      </w:tblPr>
+      <w:tcPr>
+        <w:shd w:val="clear" w:color="ffffff"/>
+        <w:tcBorders>
+          <w:top w:val="none" w:color="000000" w:sz="4" w:space="0"/>
+          <w:left w:val="none" w:color="000000" w:sz="4" w:space="0"/>
+          <w:bottom w:val="none" w:color="000000" w:sz="4" w:space="0"/>
+          <w:right w:val="none" w:color="000000" w:sz="4" w:space="0"/>
+        </w:tcBorders>
+      </w:tcPr>
+    </w:tblStylePr>
+    <w:tblStylePr w:type="lastRow">
+      <w:rPr>
+        <w:b/>
+        <w:color w:val="404040"/>
+      </w:rPr>
+      <w:pPr>
+        <w:pBdr/>
+        <w:spacing/>
+        <w:ind/>
+      </w:pPr>
+      <w:tblPr>
+        <w:tblBorders/>
+      </w:tblPr>
+      <w:tcPr>
+        <w:shd w:val="clear" w:color="ffffff"/>
+        <w:tcBorders>
+          <w:top w:val="none" w:color="000000" w:sz="4" w:space="0"/>
+          <w:left w:val="none" w:color="000000" w:sz="4" w:space="0"/>
+          <w:bottom w:val="none" w:color="000000" w:sz="4" w:space="0"/>
+          <w:right w:val="none" w:color="000000" w:sz="4" w:space="0"/>
+        </w:tcBorders>
+      </w:tcPr>
+    </w:tblStylePr>
     <w:tblStylePr w:type="nwCell">
       <w:pPr>
         <w:pBdr/>
@@ -6398,9 +6434,9 @@
       </w:tcPr>
     </w:tblStylePr>
   </w:style>
-  <w:style w:type="table" w:styleId="37">
+  <w:style w:type="table" w:styleId="726">
     <w:name w:val="Grid Table 3 - Accent 4"/>
-    <w:basedOn w:val="665"/>
+    <w:basedOn w:val="887"/>
     <w:uiPriority w:val="99"/>
     <w:pPr>
       <w:pBdr/>
@@ -6499,29 +6535,6 @@
         <w:tblBorders/>
       </w:tblPr>
       <w:tcPr>
-        <w:shd w:color="ffffff"/>
-        <w:tcBorders>
-          <w:top w:val="none" w:color="000000" w:sz="4" w:space="0"/>
-          <w:left w:val="none" w:color="000000" w:sz="4" w:space="0"/>
-          <w:bottom w:val="none" w:color="000000" w:sz="4" w:space="0"/>
-          <w:right w:val="none" w:color="000000" w:sz="4" w:space="0"/>
-        </w:tcBorders>
-      </w:tcPr>
-    </w:tblStylePr>
-    <w:tblStylePr w:type="firstRow">
-      <w:rPr>
-        <w:b/>
-        <w:color w:val="404040"/>
-      </w:rPr>
-      <w:pPr>
-        <w:pBdr/>
-        <w:spacing/>
-        <w:ind/>
-      </w:pPr>
-      <w:tblPr>
-        <w:tblBorders/>
-      </w:tblPr>
-      <w:tcPr>
         <w:shd w:val="clear" w:color="ffffff"/>
         <w:tcBorders>
           <w:top w:val="none" w:color="000000" w:sz="4" w:space="0"/>
@@ -6531,30 +6544,7 @@
         </w:tcBorders>
       </w:tcPr>
     </w:tblStylePr>
-    <w:tblStylePr w:type="lastCol">
-      <w:rPr>
-        <w:i/>
-        <w:color w:val="404040"/>
-      </w:rPr>
-      <w:pPr>
-        <w:pBdr/>
-        <w:spacing/>
-        <w:ind/>
-      </w:pPr>
-      <w:tblPr>
-        <w:tblBorders/>
-      </w:tblPr>
-      <w:tcPr>
-        <w:shd w:color="ffffff"/>
-        <w:tcBorders>
-          <w:top w:val="none" w:color="000000" w:sz="4" w:space="0"/>
-          <w:left w:val="none" w:color="000000" w:sz="4" w:space="0"/>
-          <w:bottom w:val="none" w:color="000000" w:sz="4" w:space="0"/>
-          <w:right w:val="none" w:color="000000" w:sz="4" w:space="0"/>
-        </w:tcBorders>
-      </w:tcPr>
-    </w:tblStylePr>
-    <w:tblStylePr w:type="lastRow">
+    <w:tblStylePr w:type="firstRow">
       <w:rPr>
         <w:b/>
         <w:color w:val="404040"/>
@@ -6577,6 +6567,52 @@
         </w:tcBorders>
       </w:tcPr>
     </w:tblStylePr>
+    <w:tblStylePr w:type="lastCol">
+      <w:rPr>
+        <w:i/>
+        <w:color w:val="404040"/>
+      </w:rPr>
+      <w:pPr>
+        <w:pBdr/>
+        <w:spacing/>
+        <w:ind/>
+      </w:pPr>
+      <w:tblPr>
+        <w:tblBorders/>
+      </w:tblPr>
+      <w:tcPr>
+        <w:shd w:val="clear" w:color="ffffff"/>
+        <w:tcBorders>
+          <w:top w:val="none" w:color="000000" w:sz="4" w:space="0"/>
+          <w:left w:val="none" w:color="000000" w:sz="4" w:space="0"/>
+          <w:bottom w:val="none" w:color="000000" w:sz="4" w:space="0"/>
+          <w:right w:val="none" w:color="000000" w:sz="4" w:space="0"/>
+        </w:tcBorders>
+      </w:tcPr>
+    </w:tblStylePr>
+    <w:tblStylePr w:type="lastRow">
+      <w:rPr>
+        <w:b/>
+        <w:color w:val="404040"/>
+      </w:rPr>
+      <w:pPr>
+        <w:pBdr/>
+        <w:spacing/>
+        <w:ind/>
+      </w:pPr>
+      <w:tblPr>
+        <w:tblBorders/>
+      </w:tblPr>
+      <w:tcPr>
+        <w:shd w:val="clear" w:color="ffffff"/>
+        <w:tcBorders>
+          <w:top w:val="none" w:color="000000" w:sz="4" w:space="0"/>
+          <w:left w:val="none" w:color="000000" w:sz="4" w:space="0"/>
+          <w:bottom w:val="none" w:color="000000" w:sz="4" w:space="0"/>
+          <w:right w:val="none" w:color="000000" w:sz="4" w:space="0"/>
+        </w:tcBorders>
+      </w:tcPr>
+    </w:tblStylePr>
     <w:tblStylePr w:type="nwCell">
       <w:pPr>
         <w:pBdr/>
@@ -6643,9 +6679,9 @@
       </w:tcPr>
     </w:tblStylePr>
   </w:style>
-  <w:style w:type="table" w:styleId="38">
+  <w:style w:type="table" w:styleId="727">
     <w:name w:val="Grid Table 3 - Accent 5"/>
-    <w:basedOn w:val="665"/>
+    <w:basedOn w:val="887"/>
     <w:uiPriority w:val="99"/>
     <w:pPr>
       <w:pBdr/>
@@ -6744,29 +6780,6 @@
         <w:tblBorders/>
       </w:tblPr>
       <w:tcPr>
-        <w:shd w:color="ffffff"/>
-        <w:tcBorders>
-          <w:top w:val="none" w:color="000000" w:sz="4" w:space="0"/>
-          <w:left w:val="none" w:color="000000" w:sz="4" w:space="0"/>
-          <w:bottom w:val="none" w:color="000000" w:sz="4" w:space="0"/>
-          <w:right w:val="none" w:color="000000" w:sz="4" w:space="0"/>
-        </w:tcBorders>
-      </w:tcPr>
-    </w:tblStylePr>
-    <w:tblStylePr w:type="firstRow">
-      <w:rPr>
-        <w:b/>
-        <w:color w:val="404040"/>
-      </w:rPr>
-      <w:pPr>
-        <w:pBdr/>
-        <w:spacing/>
-        <w:ind/>
-      </w:pPr>
-      <w:tblPr>
-        <w:tblBorders/>
-      </w:tblPr>
-      <w:tcPr>
         <w:shd w:val="clear" w:color="ffffff"/>
         <w:tcBorders>
           <w:top w:val="none" w:color="000000" w:sz="4" w:space="0"/>
@@ -6776,30 +6789,7 @@
         </w:tcBorders>
       </w:tcPr>
     </w:tblStylePr>
-    <w:tblStylePr w:type="lastCol">
-      <w:rPr>
-        <w:i/>
-        <w:color w:val="404040"/>
-      </w:rPr>
-      <w:pPr>
-        <w:pBdr/>
-        <w:spacing/>
-        <w:ind/>
-      </w:pPr>
-      <w:tblPr>
-        <w:tblBorders/>
-      </w:tblPr>
-      <w:tcPr>
-        <w:shd w:color="ffffff"/>
-        <w:tcBorders>
-          <w:top w:val="none" w:color="000000" w:sz="4" w:space="0"/>
-          <w:left w:val="none" w:color="000000" w:sz="4" w:space="0"/>
-          <w:bottom w:val="none" w:color="000000" w:sz="4" w:space="0"/>
-          <w:right w:val="none" w:color="000000" w:sz="4" w:space="0"/>
-        </w:tcBorders>
-      </w:tcPr>
-    </w:tblStylePr>
-    <w:tblStylePr w:type="lastRow">
+    <w:tblStylePr w:type="firstRow">
       <w:rPr>
         <w:b/>
         <w:color w:val="404040"/>
@@ -6822,6 +6812,52 @@
         </w:tcBorders>
       </w:tcPr>
     </w:tblStylePr>
+    <w:tblStylePr w:type="lastCol">
+      <w:rPr>
+        <w:i/>
+        <w:color w:val="404040"/>
+      </w:rPr>
+      <w:pPr>
+        <w:pBdr/>
+        <w:spacing/>
+        <w:ind/>
+      </w:pPr>
+      <w:tblPr>
+        <w:tblBorders/>
+      </w:tblPr>
+      <w:tcPr>
+        <w:shd w:val="clear" w:color="ffffff"/>
+        <w:tcBorders>
+          <w:top w:val="none" w:color="000000" w:sz="4" w:space="0"/>
+          <w:left w:val="none" w:color="000000" w:sz="4" w:space="0"/>
+          <w:bottom w:val="none" w:color="000000" w:sz="4" w:space="0"/>
+          <w:right w:val="none" w:color="000000" w:sz="4" w:space="0"/>
+        </w:tcBorders>
+      </w:tcPr>
+    </w:tblStylePr>
+    <w:tblStylePr w:type="lastRow">
+      <w:rPr>
+        <w:b/>
+        <w:color w:val="404040"/>
+      </w:rPr>
+      <w:pPr>
+        <w:pBdr/>
+        <w:spacing/>
+        <w:ind/>
+      </w:pPr>
+      <w:tblPr>
+        <w:tblBorders/>
+      </w:tblPr>
+      <w:tcPr>
+        <w:shd w:val="clear" w:color="ffffff"/>
+        <w:tcBorders>
+          <w:top w:val="none" w:color="000000" w:sz="4" w:space="0"/>
+          <w:left w:val="none" w:color="000000" w:sz="4" w:space="0"/>
+          <w:bottom w:val="none" w:color="000000" w:sz="4" w:space="0"/>
+          <w:right w:val="none" w:color="000000" w:sz="4" w:space="0"/>
+        </w:tcBorders>
+      </w:tcPr>
+    </w:tblStylePr>
     <w:tblStylePr w:type="nwCell">
       <w:pPr>
         <w:pBdr/>
@@ -6888,9 +6924,9 @@
       </w:tcPr>
     </w:tblStylePr>
   </w:style>
-  <w:style w:type="table" w:styleId="39">
+  <w:style w:type="table" w:styleId="728">
     <w:name w:val="Grid Table 3 - Accent 6"/>
-    <w:basedOn w:val="665"/>
+    <w:basedOn w:val="887"/>
     <w:uiPriority w:val="99"/>
     <w:pPr>
       <w:pBdr/>
@@ -6989,29 +7025,6 @@
         <w:tblBorders/>
       </w:tblPr>
       <w:tcPr>
-        <w:shd w:color="ffffff"/>
-        <w:tcBorders>
-          <w:top w:val="none" w:color="000000" w:sz="4" w:space="0"/>
-          <w:left w:val="none" w:color="000000" w:sz="4" w:space="0"/>
-          <w:bottom w:val="none" w:color="000000" w:sz="4" w:space="0"/>
-          <w:right w:val="none" w:color="000000" w:sz="4" w:space="0"/>
-        </w:tcBorders>
-      </w:tcPr>
-    </w:tblStylePr>
-    <w:tblStylePr w:type="firstRow">
-      <w:rPr>
-        <w:b/>
-        <w:color w:val="404040"/>
-      </w:rPr>
-      <w:pPr>
-        <w:pBdr/>
-        <w:spacing/>
-        <w:ind/>
-      </w:pPr>
-      <w:tblPr>
-        <w:tblBorders/>
-      </w:tblPr>
-      <w:tcPr>
         <w:shd w:val="clear" w:color="ffffff"/>
         <w:tcBorders>
           <w:top w:val="none" w:color="000000" w:sz="4" w:space="0"/>
@@ -7021,30 +7034,7 @@
         </w:tcBorders>
       </w:tcPr>
     </w:tblStylePr>
-    <w:tblStylePr w:type="lastCol">
-      <w:rPr>
-        <w:i/>
-        <w:color w:val="404040"/>
-      </w:rPr>
-      <w:pPr>
-        <w:pBdr/>
-        <w:spacing/>
-        <w:ind/>
-      </w:pPr>
-      <w:tblPr>
-        <w:tblBorders/>
-      </w:tblPr>
-      <w:tcPr>
-        <w:shd w:color="ffffff"/>
-        <w:tcBorders>
-          <w:top w:val="none" w:color="000000" w:sz="4" w:space="0"/>
-          <w:left w:val="none" w:color="000000" w:sz="4" w:space="0"/>
-          <w:bottom w:val="none" w:color="000000" w:sz="4" w:space="0"/>
-          <w:right w:val="none" w:color="000000" w:sz="4" w:space="0"/>
-        </w:tcBorders>
-      </w:tcPr>
-    </w:tblStylePr>
-    <w:tblStylePr w:type="lastRow">
+    <w:tblStylePr w:type="firstRow">
       <w:rPr>
         <w:b/>
         <w:color w:val="404040"/>
@@ -7067,6 +7057,52 @@
         </w:tcBorders>
       </w:tcPr>
     </w:tblStylePr>
+    <w:tblStylePr w:type="lastCol">
+      <w:rPr>
+        <w:i/>
+        <w:color w:val="404040"/>
+      </w:rPr>
+      <w:pPr>
+        <w:pBdr/>
+        <w:spacing/>
+        <w:ind/>
+      </w:pPr>
+      <w:tblPr>
+        <w:tblBorders/>
+      </w:tblPr>
+      <w:tcPr>
+        <w:shd w:val="clear" w:color="ffffff"/>
+        <w:tcBorders>
+          <w:top w:val="none" w:color="000000" w:sz="4" w:space="0"/>
+          <w:left w:val="none" w:color="000000" w:sz="4" w:space="0"/>
+          <w:bottom w:val="none" w:color="000000" w:sz="4" w:space="0"/>
+          <w:right w:val="none" w:color="000000" w:sz="4" w:space="0"/>
+        </w:tcBorders>
+      </w:tcPr>
+    </w:tblStylePr>
+    <w:tblStylePr w:type="lastRow">
+      <w:rPr>
+        <w:b/>
+        <w:color w:val="404040"/>
+      </w:rPr>
+      <w:pPr>
+        <w:pBdr/>
+        <w:spacing/>
+        <w:ind/>
+      </w:pPr>
+      <w:tblPr>
+        <w:tblBorders/>
+      </w:tblPr>
+      <w:tcPr>
+        <w:shd w:val="clear" w:color="ffffff"/>
+        <w:tcBorders>
+          <w:top w:val="none" w:color="000000" w:sz="4" w:space="0"/>
+          <w:left w:val="none" w:color="000000" w:sz="4" w:space="0"/>
+          <w:bottom w:val="none" w:color="000000" w:sz="4" w:space="0"/>
+          <w:right w:val="none" w:color="000000" w:sz="4" w:space="0"/>
+        </w:tcBorders>
+      </w:tcPr>
+    </w:tblStylePr>
     <w:tblStylePr w:type="nwCell">
       <w:pPr>
         <w:pBdr/>
@@ -7133,9 +7169,9 @@
       </w:tcPr>
     </w:tblStylePr>
   </w:style>
-  <w:style w:type="table" w:styleId="40">
+  <w:style w:type="table" w:styleId="729">
     <w:name w:val="Grid Table 4"/>
-    <w:basedOn w:val="665"/>
+    <w:basedOn w:val="887"/>
     <w:uiPriority w:val="59"/>
     <w:pPr>
       <w:pBdr/>
@@ -7366,9 +7402,9 @@
       </w:tcPr>
     </w:tblStylePr>
   </w:style>
-  <w:style w:type="table" w:styleId="41">
+  <w:style w:type="table" w:styleId="730">
     <w:name w:val="Grid Table 4 - Accent 1"/>
-    <w:basedOn w:val="665"/>
+    <w:basedOn w:val="887"/>
     <w:uiPriority w:val="59"/>
     <w:pPr>
       <w:pBdr/>
@@ -7599,9 +7635,9 @@
       </w:tcPr>
     </w:tblStylePr>
   </w:style>
-  <w:style w:type="table" w:styleId="42">
+  <w:style w:type="table" w:styleId="731">
     <w:name w:val="Grid Table 4 - Accent 2"/>
-    <w:basedOn w:val="665"/>
+    <w:basedOn w:val="887"/>
     <w:uiPriority w:val="59"/>
     <w:pPr>
       <w:pBdr/>
@@ -7832,9 +7868,9 @@
       </w:tcPr>
     </w:tblStylePr>
   </w:style>
-  <w:style w:type="table" w:styleId="43">
+  <w:style w:type="table" w:styleId="732">
     <w:name w:val="Grid Table 4 - Accent 3"/>
-    <w:basedOn w:val="665"/>
+    <w:basedOn w:val="887"/>
     <w:uiPriority w:val="59"/>
     <w:pPr>
       <w:pBdr/>
@@ -8065,9 +8101,9 @@
       </w:tcPr>
     </w:tblStylePr>
   </w:style>
-  <w:style w:type="table" w:styleId="44">
+  <w:style w:type="table" w:styleId="733">
     <w:name w:val="Grid Table 4 - Accent 4"/>
-    <w:basedOn w:val="665"/>
+    <w:basedOn w:val="887"/>
     <w:uiPriority w:val="59"/>
     <w:pPr>
       <w:pBdr/>
@@ -8298,9 +8334,9 @@
       </w:tcPr>
     </w:tblStylePr>
   </w:style>
-  <w:style w:type="table" w:styleId="45">
+  <w:style w:type="table" w:styleId="734">
     <w:name w:val="Grid Table 4 - Accent 5"/>
-    <w:basedOn w:val="665"/>
+    <w:basedOn w:val="887"/>
     <w:uiPriority w:val="59"/>
     <w:pPr>
       <w:pBdr/>
@@ -8531,9 +8567,9 @@
       </w:tcPr>
     </w:tblStylePr>
   </w:style>
-  <w:style w:type="table" w:styleId="46">
+  <w:style w:type="table" w:styleId="735">
     <w:name w:val="Grid Table 4 - Accent 6"/>
-    <w:basedOn w:val="665"/>
+    <w:basedOn w:val="887"/>
     <w:uiPriority w:val="59"/>
     <w:pPr>
       <w:pBdr/>
@@ -8764,9 +8800,9 @@
       </w:tcPr>
     </w:tblStylePr>
   </w:style>
-  <w:style w:type="table" w:styleId="47">
+  <w:style w:type="table" w:styleId="736">
     <w:name w:val="Grid Table 5 Dark"/>
-    <w:basedOn w:val="665"/>
+    <w:basedOn w:val="887"/>
     <w:uiPriority w:val="99"/>
     <w:pPr>
       <w:pBdr/>
@@ -8992,9 +9028,9 @@
       </w:tcPr>
     </w:tblStylePr>
   </w:style>
-  <w:style w:type="table" w:styleId="48">
+  <w:style w:type="table" w:styleId="737">
     <w:name w:val="Grid Table 5 Dark- Accent 1"/>
-    <w:basedOn w:val="665"/>
+    <w:basedOn w:val="887"/>
     <w:uiPriority w:val="99"/>
     <w:pPr>
       <w:pBdr/>
@@ -9220,9 +9256,9 @@
       </w:tcPr>
     </w:tblStylePr>
   </w:style>
-  <w:style w:type="table" w:styleId="49">
+  <w:style w:type="table" w:styleId="738">
     <w:name w:val="Grid Table 5 Dark - Accent 2"/>
-    <w:basedOn w:val="665"/>
+    <w:basedOn w:val="887"/>
     <w:uiPriority w:val="99"/>
     <w:pPr>
       <w:pBdr/>
@@ -9448,9 +9484,9 @@
       </w:tcPr>
     </w:tblStylePr>
   </w:style>
-  <w:style w:type="table" w:styleId="50">
+  <w:style w:type="table" w:styleId="739">
     <w:name w:val="Grid Table 5 Dark - Accent 3"/>
-    <w:basedOn w:val="665"/>
+    <w:basedOn w:val="887"/>
     <w:uiPriority w:val="99"/>
     <w:pPr>
       <w:pBdr/>
@@ -9676,9 +9712,9 @@
       </w:tcPr>
     </w:tblStylePr>
   </w:style>
-  <w:style w:type="table" w:styleId="51">
+  <w:style w:type="table" w:styleId="740">
     <w:name w:val="Grid Table 5 Dark- Accent 4"/>
-    <w:basedOn w:val="665"/>
+    <w:basedOn w:val="887"/>
     <w:uiPriority w:val="99"/>
     <w:pPr>
       <w:pBdr/>
@@ -9904,9 +9940,9 @@
       </w:tcPr>
     </w:tblStylePr>
   </w:style>
-  <w:style w:type="table" w:styleId="52">
+  <w:style w:type="table" w:styleId="741">
     <w:name w:val="Grid Table 5 Dark - Accent 5"/>
-    <w:basedOn w:val="665"/>
+    <w:basedOn w:val="887"/>
     <w:uiPriority w:val="99"/>
     <w:pPr>
       <w:pBdr/>
@@ -10132,9 +10168,9 @@
       </w:tcPr>
     </w:tblStylePr>
   </w:style>
-  <w:style w:type="table" w:styleId="53">
+  <w:style w:type="table" w:styleId="742">
     <w:name w:val="Grid Table 5 Dark - Accent 6"/>
-    <w:basedOn w:val="665"/>
+    <w:basedOn w:val="887"/>
     <w:uiPriority w:val="99"/>
     <w:pPr>
       <w:pBdr/>
@@ -10360,9 +10396,9 @@
       </w:tcPr>
     </w:tblStylePr>
   </w:style>
-  <w:style w:type="table" w:styleId="54">
+  <w:style w:type="table" w:styleId="743">
     <w:name w:val="Grid Table 6 Colorful"/>
-    <w:basedOn w:val="665"/>
+    <w:basedOn w:val="887"/>
     <w:uiPriority w:val="99"/>
     <w:pPr>
       <w:pBdr/>
@@ -10590,9 +10626,9 @@
       </w:tcPr>
     </w:tblStylePr>
   </w:style>
-  <w:style w:type="table" w:styleId="55">
+  <w:style w:type="table" w:styleId="744">
     <w:name w:val="Grid Table 6 Colorful - Accent 1"/>
-    <w:basedOn w:val="665"/>
+    <w:basedOn w:val="887"/>
     <w:uiPriority w:val="99"/>
     <w:pPr>
       <w:pBdr/>
@@ -10820,9 +10856,9 @@
       </w:tcPr>
     </w:tblStylePr>
   </w:style>
-  <w:style w:type="table" w:styleId="56">
+  <w:style w:type="table" w:styleId="745">
     <w:name w:val="Grid Table 6 Colorful - Accent 2"/>
-    <w:basedOn w:val="665"/>
+    <w:basedOn w:val="887"/>
     <w:uiPriority w:val="99"/>
     <w:pPr>
       <w:pBdr/>
@@ -11050,9 +11086,9 @@
       </w:tcPr>
     </w:tblStylePr>
   </w:style>
-  <w:style w:type="table" w:styleId="57">
+  <w:style w:type="table" w:styleId="746">
     <w:name w:val="Grid Table 6 Colorful - Accent 3"/>
-    <w:basedOn w:val="665"/>
+    <w:basedOn w:val="887"/>
     <w:uiPriority w:val="99"/>
     <w:pPr>
       <w:pBdr/>
@@ -11280,9 +11316,9 @@
       </w:tcPr>
     </w:tblStylePr>
   </w:style>
-  <w:style w:type="table" w:styleId="58">
+  <w:style w:type="table" w:styleId="747">
     <w:name w:val="Grid Table 6 Colorful - Accent 4"/>
-    <w:basedOn w:val="665"/>
+    <w:basedOn w:val="887"/>
     <w:uiPriority w:val="99"/>
     <w:pPr>
       <w:pBdr/>
@@ -11510,9 +11546,9 @@
       </w:tcPr>
     </w:tblStylePr>
   </w:style>
-  <w:style w:type="table" w:styleId="59">
+  <w:style w:type="table" w:styleId="748">
     <w:name w:val="Grid Table 6 Colorful - Accent 5"/>
-    <w:basedOn w:val="665"/>
+    <w:basedOn w:val="887"/>
     <w:uiPriority w:val="99"/>
     <w:pPr>
       <w:pBdr/>
@@ -11740,9 +11776,9 @@
       </w:tcPr>
     </w:tblStylePr>
   </w:style>
-  <w:style w:type="table" w:styleId="60">
+  <w:style w:type="table" w:styleId="749">
     <w:name w:val="Grid Table 6 Colorful - Accent 6"/>
-    <w:basedOn w:val="665"/>
+    <w:basedOn w:val="887"/>
     <w:uiPriority w:val="99"/>
     <w:pPr>
       <w:pBdr/>
@@ -11970,9 +12006,9 @@
       </w:tcPr>
     </w:tblStylePr>
   </w:style>
-  <w:style w:type="table" w:styleId="61">
+  <w:style w:type="table" w:styleId="750">
     <w:name w:val="Grid Table 7 Colorful"/>
-    <w:basedOn w:val="665"/>
+    <w:basedOn w:val="887"/>
     <w:uiPriority w:val="99"/>
     <w:pPr>
       <w:pBdr/>
@@ -12074,11 +12110,11 @@
         <w:tblBorders/>
       </w:tblPr>
       <w:tcPr>
-        <w:shd w:color="ffffff"/>
+        <w:shd w:val="clear" w:color="ffffff"/>
         <w:tcBorders>
-          <w:top w:val="none"/>
-          <w:left w:val="none"/>
-          <w:bottom w:val="none"/>
+          <w:top w:val="none" w:color="000000" w:sz="4" w:space="0"/>
+          <w:left w:val="none" w:color="000000" w:sz="4" w:space="0"/>
+          <w:bottom w:val="none" w:color="000000" w:sz="4" w:space="0"/>
           <w:right w:val="single" w:color="000000" w:themeColor="text1" w:themeTint="80" w:sz="4" w:space="0"/>
         </w:tcBorders>
       </w:tcPr>
@@ -12101,10 +12137,10 @@
       <w:tcPr>
         <w:shd w:val="clear" w:color="ffffff" w:themeColor="light1" w:fill="ffffff" w:themeFill="light1"/>
         <w:tcBorders>
-          <w:top w:val="none"/>
-          <w:left w:val="none"/>
+          <w:top w:val="none" w:color="000000" w:sz="4" w:space="0"/>
+          <w:left w:val="none" w:color="000000" w:sz="4" w:space="0"/>
           <w:bottom w:val="single" w:color="000000" w:themeColor="text1" w:themeTint="80" w:sz="4" w:space="0"/>
-          <w:right w:val="none"/>
+          <w:right w:val="none" w:color="000000" w:sz="4" w:space="0"/>
         </w:tcBorders>
       </w:tcPr>
     </w:tblStylePr>
@@ -12124,12 +12160,12 @@
         <w:tblBorders/>
       </w:tblPr>
       <w:tcPr>
-        <w:shd w:color="ffffff"/>
+        <w:shd w:val="clear" w:color="ffffff"/>
         <w:tcBorders>
-          <w:top w:val="none"/>
+          <w:top w:val="none" w:color="000000" w:sz="4" w:space="0"/>
           <w:left w:val="single" w:color="000000" w:themeColor="text1" w:themeTint="80" w:sz="4" w:space="0"/>
-          <w:bottom w:val="none"/>
-          <w:right w:val="none"/>
+          <w:bottom w:val="none" w:color="000000" w:sz="4" w:space="0"/>
+          <w:right w:val="none" w:color="000000" w:sz="4" w:space="0"/>
         </w:tcBorders>
       </w:tcPr>
     </w:tblStylePr>
@@ -12152,9 +12188,9 @@
         <w:shd w:val="clear" w:color="ffffff" w:themeColor="light1" w:fill="ffffff" w:themeFill="light1"/>
         <w:tcBorders>
           <w:top w:val="single" w:color="000000" w:themeColor="text1" w:themeTint="80" w:sz="4" w:space="0"/>
-          <w:left w:val="none"/>
-          <w:bottom w:val="none"/>
-          <w:right w:val="none"/>
+          <w:left w:val="none" w:color="000000" w:sz="4" w:space="0"/>
+          <w:bottom w:val="none" w:color="000000" w:sz="4" w:space="0"/>
+          <w:right w:val="none" w:color="000000" w:sz="4" w:space="0"/>
         </w:tcBorders>
       </w:tcPr>
     </w:tblStylePr>
@@ -12224,9 +12260,9 @@
       </w:tcPr>
     </w:tblStylePr>
   </w:style>
-  <w:style w:type="table" w:styleId="62">
+  <w:style w:type="table" w:styleId="751">
     <w:name w:val="Grid Table 7 Colorful - Accent 1"/>
-    <w:basedOn w:val="665"/>
+    <w:basedOn w:val="887"/>
     <w:uiPriority w:val="99"/>
     <w:pPr>
       <w:pBdr/>
@@ -12328,11 +12364,11 @@
         <w:tblBorders/>
       </w:tblPr>
       <w:tcPr>
-        <w:shd w:color="ffffff"/>
+        <w:shd w:val="clear" w:color="ffffff"/>
         <w:tcBorders>
-          <w:top w:val="none"/>
-          <w:left w:val="none"/>
-          <w:bottom w:val="none"/>
+          <w:top w:val="none" w:color="000000" w:sz="4" w:space="0"/>
+          <w:left w:val="none" w:color="000000" w:sz="4" w:space="0"/>
+          <w:bottom w:val="none" w:color="000000" w:sz="4" w:space="0"/>
           <w:right w:val="single" w:color="000000" w:themeColor="accent1" w:themeTint="80" w:sz="4" w:space="0"/>
         </w:tcBorders>
       </w:tcPr>
@@ -12355,10 +12391,10 @@
       <w:tcPr>
         <w:shd w:val="clear" w:color="ffffff" w:themeColor="light1" w:fill="ffffff" w:themeFill="light1"/>
         <w:tcBorders>
-          <w:top w:val="none"/>
-          <w:left w:val="none"/>
+          <w:top w:val="none" w:color="000000" w:sz="4" w:space="0"/>
+          <w:left w:val="none" w:color="000000" w:sz="4" w:space="0"/>
           <w:bottom w:val="single" w:color="000000" w:themeColor="accent1" w:themeTint="80" w:sz="4" w:space="0"/>
-          <w:right w:val="none"/>
+          <w:right w:val="none" w:color="000000" w:sz="4" w:space="0"/>
         </w:tcBorders>
       </w:tcPr>
     </w:tblStylePr>
@@ -12378,12 +12414,12 @@
         <w:tblBorders/>
       </w:tblPr>
       <w:tcPr>
-        <w:shd w:color="ffffff"/>
+        <w:shd w:val="clear" w:color="ffffff"/>
         <w:tcBorders>
-          <w:top w:val="none"/>
+          <w:top w:val="none" w:color="000000" w:sz="4" w:space="0"/>
           <w:left w:val="single" w:color="000000" w:themeColor="accent1" w:themeTint="80" w:sz="4" w:space="0"/>
-          <w:bottom w:val="none"/>
-          <w:right w:val="none"/>
+          <w:bottom w:val="none" w:color="000000" w:sz="4" w:space="0"/>
+          <w:right w:val="none" w:color="000000" w:sz="4" w:space="0"/>
         </w:tcBorders>
       </w:tcPr>
     </w:tblStylePr>
@@ -12406,9 +12442,9 @@
         <w:shd w:val="clear" w:color="ffffff" w:themeColor="light1" w:fill="ffffff" w:themeFill="light1"/>
         <w:tcBorders>
           <w:top w:val="single" w:color="000000" w:themeColor="accent1" w:themeTint="80" w:sz="4" w:space="0"/>
-          <w:left w:val="none"/>
-          <w:bottom w:val="none"/>
-          <w:right w:val="none"/>
+          <w:left w:val="none" w:color="000000" w:sz="4" w:space="0"/>
+          <w:bottom w:val="none" w:color="000000" w:sz="4" w:space="0"/>
+          <w:right w:val="none" w:color="000000" w:sz="4" w:space="0"/>
         </w:tcBorders>
       </w:tcPr>
     </w:tblStylePr>
@@ -12478,9 +12514,9 @@
       </w:tcPr>
     </w:tblStylePr>
   </w:style>
-  <w:style w:type="table" w:styleId="63">
+  <w:style w:type="table" w:styleId="752">
     <w:name w:val="Grid Table 7 Colorful - Accent 2"/>
-    <w:basedOn w:val="665"/>
+    <w:basedOn w:val="887"/>
     <w:uiPriority w:val="99"/>
     <w:pPr>
       <w:pBdr/>
@@ -12582,11 +12618,11 @@
         <w:tblBorders/>
       </w:tblPr>
       <w:tcPr>
-        <w:shd w:color="ffffff"/>
+        <w:shd w:val="clear" w:color="ffffff"/>
         <w:tcBorders>
-          <w:top w:val="none"/>
-          <w:left w:val="none"/>
-          <w:bottom w:val="none"/>
+          <w:top w:val="none" w:color="000000" w:sz="4" w:space="0"/>
+          <w:left w:val="none" w:color="000000" w:sz="4" w:space="0"/>
+          <w:bottom w:val="none" w:color="000000" w:sz="4" w:space="0"/>
           <w:right w:val="single" w:color="000000" w:themeColor="accent2" w:themeTint="97" w:sz="4" w:space="0"/>
         </w:tcBorders>
       </w:tcPr>
@@ -12609,10 +12645,10 @@
       <w:tcPr>
         <w:shd w:val="clear" w:color="ffffff" w:themeColor="light1" w:fill="ffffff" w:themeFill="light1"/>
         <w:tcBorders>
-          <w:top w:val="none"/>
-          <w:left w:val="none"/>
+          <w:top w:val="none" w:color="000000" w:sz="4" w:space="0"/>
+          <w:left w:val="none" w:color="000000" w:sz="4" w:space="0"/>
           <w:bottom w:val="single" w:color="000000" w:themeColor="accent2" w:themeTint="97" w:sz="4" w:space="0"/>
-          <w:right w:val="none"/>
+          <w:right w:val="none" w:color="000000" w:sz="4" w:space="0"/>
         </w:tcBorders>
       </w:tcPr>
     </w:tblStylePr>
@@ -12632,12 +12668,12 @@
         <w:tblBorders/>
       </w:tblPr>
       <w:tcPr>
-        <w:shd w:color="ffffff"/>
+        <w:shd w:val="clear" w:color="ffffff"/>
         <w:tcBorders>
-          <w:top w:val="none"/>
+          <w:top w:val="none" w:color="000000" w:sz="4" w:space="0"/>
           <w:left w:val="single" w:color="000000" w:themeColor="accent2" w:themeTint="97" w:sz="4" w:space="0"/>
-          <w:bottom w:val="none"/>
-          <w:right w:val="none"/>
+          <w:bottom w:val="none" w:color="000000" w:sz="4" w:space="0"/>
+          <w:right w:val="none" w:color="000000" w:sz="4" w:space="0"/>
         </w:tcBorders>
       </w:tcPr>
     </w:tblStylePr>
@@ -12660,9 +12696,9 @@
         <w:shd w:val="clear" w:color="ffffff" w:themeColor="light1" w:fill="ffffff" w:themeFill="light1"/>
         <w:tcBorders>
           <w:top w:val="single" w:color="000000" w:themeColor="accent2" w:themeTint="97" w:sz="4" w:space="0"/>
-          <w:left w:val="none"/>
-          <w:bottom w:val="none"/>
-          <w:right w:val="none"/>
+          <w:left w:val="none" w:color="000000" w:sz="4" w:space="0"/>
+          <w:bottom w:val="none" w:color="000000" w:sz="4" w:space="0"/>
+          <w:right w:val="none" w:color="000000" w:sz="4" w:space="0"/>
         </w:tcBorders>
       </w:tcPr>
     </w:tblStylePr>
@@ -12732,9 +12768,9 @@
       </w:tcPr>
     </w:tblStylePr>
   </w:style>
-  <w:style w:type="table" w:styleId="64">
+  <w:style w:type="table" w:styleId="753">
     <w:name w:val="Grid Table 7 Colorful - Accent 3"/>
-    <w:basedOn w:val="665"/>
+    <w:basedOn w:val="887"/>
     <w:uiPriority w:val="99"/>
     <w:pPr>
       <w:pBdr/>
@@ -12836,11 +12872,11 @@
         <w:tblBorders/>
       </w:tblPr>
       <w:tcPr>
-        <w:shd w:color="ffffff"/>
+        <w:shd w:val="clear" w:color="ffffff"/>
         <w:tcBorders>
-          <w:top w:val="none"/>
-          <w:left w:val="none"/>
-          <w:bottom w:val="none"/>
+          <w:top w:val="none" w:color="000000" w:sz="4" w:space="0"/>
+          <w:left w:val="none" w:color="000000" w:sz="4" w:space="0"/>
+          <w:bottom w:val="none" w:color="000000" w:sz="4" w:space="0"/>
           <w:right w:val="single" w:color="000000" w:themeColor="accent3" w:themeTint="FE" w:sz="4" w:space="0"/>
         </w:tcBorders>
       </w:tcPr>
@@ -12863,10 +12899,10 @@
       <w:tcPr>
         <w:shd w:val="clear" w:color="ffffff" w:themeColor="light1" w:fill="ffffff" w:themeFill="light1"/>
         <w:tcBorders>
-          <w:top w:val="none"/>
-          <w:left w:val="none"/>
+          <w:top w:val="none" w:color="000000" w:sz="4" w:space="0"/>
+          <w:left w:val="none" w:color="000000" w:sz="4" w:space="0"/>
           <w:bottom w:val="single" w:color="000000" w:themeColor="accent3" w:themeTint="FE" w:sz="4" w:space="0"/>
-          <w:right w:val="none"/>
+          <w:right w:val="none" w:color="000000" w:sz="4" w:space="0"/>
         </w:tcBorders>
       </w:tcPr>
     </w:tblStylePr>
@@ -12886,12 +12922,12 @@
         <w:tblBorders/>
       </w:tblPr>
       <w:tcPr>
-        <w:shd w:color="ffffff"/>
+        <w:shd w:val="clear" w:color="ffffff"/>
         <w:tcBorders>
-          <w:top w:val="none"/>
+          <w:top w:val="none" w:color="000000" w:sz="4" w:space="0"/>
           <w:left w:val="single" w:color="000000" w:themeColor="accent3" w:themeTint="FE" w:sz="4" w:space="0"/>
-          <w:bottom w:val="none"/>
-          <w:right w:val="none"/>
+          <w:bottom w:val="none" w:color="000000" w:sz="4" w:space="0"/>
+          <w:right w:val="none" w:color="000000" w:sz="4" w:space="0"/>
         </w:tcBorders>
       </w:tcPr>
     </w:tblStylePr>
@@ -12914,9 +12950,9 @@
         <w:shd w:val="clear" w:color="ffffff" w:themeColor="light1" w:fill="ffffff" w:themeFill="light1"/>
         <w:tcBorders>
           <w:top w:val="single" w:color="000000" w:themeColor="accent3" w:themeTint="FE" w:sz="4" w:space="0"/>
-          <w:left w:val="none"/>
-          <w:bottom w:val="none"/>
-          <w:right w:val="none"/>
+          <w:left w:val="none" w:color="000000" w:sz="4" w:space="0"/>
+          <w:bottom w:val="none" w:color="000000" w:sz="4" w:space="0"/>
+          <w:right w:val="none" w:color="000000" w:sz="4" w:space="0"/>
         </w:tcBorders>
       </w:tcPr>
     </w:tblStylePr>
@@ -12986,9 +13022,9 @@
       </w:tcPr>
     </w:tblStylePr>
   </w:style>
-  <w:style w:type="table" w:styleId="65">
+  <w:style w:type="table" w:styleId="754">
     <w:name w:val="Grid Table 7 Colorful - Accent 4"/>
-    <w:basedOn w:val="665"/>
+    <w:basedOn w:val="887"/>
     <w:uiPriority w:val="99"/>
     <w:pPr>
       <w:pBdr/>
@@ -13090,11 +13126,11 @@
         <w:tblBorders/>
       </w:tblPr>
       <w:tcPr>
-        <w:shd w:color="ffffff"/>
+        <w:shd w:val="clear" w:color="ffffff"/>
         <w:tcBorders>
-          <w:top w:val="none"/>
-          <w:left w:val="none"/>
-          <w:bottom w:val="none"/>
+          <w:top w:val="none" w:color="000000" w:sz="4" w:space="0"/>
+          <w:left w:val="none" w:color="000000" w:sz="4" w:space="0"/>
+          <w:bottom w:val="none" w:color="000000" w:sz="4" w:space="0"/>
           <w:right w:val="single" w:color="000000" w:themeColor="accent4" w:themeTint="9A" w:sz="4" w:space="0"/>
         </w:tcBorders>
       </w:tcPr>
@@ -13117,10 +13153,10 @@
       <w:tcPr>
         <w:shd w:val="clear" w:color="ffffff" w:themeColor="light1" w:fill="ffffff" w:themeFill="light1"/>
         <w:tcBorders>
-          <w:top w:val="none"/>
-          <w:left w:val="none"/>
+          <w:top w:val="none" w:color="000000" w:sz="4" w:space="0"/>
+          <w:left w:val="none" w:color="000000" w:sz="4" w:space="0"/>
           <w:bottom w:val="single" w:color="000000" w:themeColor="accent4" w:themeTint="9A" w:sz="4" w:space="0"/>
-          <w:right w:val="none"/>
+          <w:right w:val="none" w:color="000000" w:sz="4" w:space="0"/>
         </w:tcBorders>
       </w:tcPr>
     </w:tblStylePr>
@@ -13140,12 +13176,12 @@
         <w:tblBorders/>
       </w:tblPr>
       <w:tcPr>
-        <w:shd w:color="ffffff"/>
+        <w:shd w:val="clear" w:color="ffffff"/>
         <w:tcBorders>
-          <w:top w:val="none"/>
+          <w:top w:val="none" w:color="000000" w:sz="4" w:space="0"/>
           <w:left w:val="single" w:color="000000" w:themeColor="accent4" w:themeTint="9A" w:sz="4" w:space="0"/>
-          <w:bottom w:val="none"/>
-          <w:right w:val="none"/>
+          <w:bottom w:val="none" w:color="000000" w:sz="4" w:space="0"/>
+          <w:right w:val="none" w:color="000000" w:sz="4" w:space="0"/>
         </w:tcBorders>
       </w:tcPr>
     </w:tblStylePr>
@@ -13168,9 +13204,9 @@
         <w:shd w:val="clear" w:color="ffffff" w:themeColor="light1" w:fill="ffffff" w:themeFill="light1"/>
         <w:tcBorders>
           <w:top w:val="single" w:color="000000" w:themeColor="accent4" w:themeTint="9A" w:sz="4" w:space="0"/>
-          <w:left w:val="none"/>
-          <w:bottom w:val="none"/>
-          <w:right w:val="none"/>
+          <w:left w:val="none" w:color="000000" w:sz="4" w:space="0"/>
+          <w:bottom w:val="none" w:color="000000" w:sz="4" w:space="0"/>
+          <w:right w:val="none" w:color="000000" w:sz="4" w:space="0"/>
         </w:tcBorders>
       </w:tcPr>
     </w:tblStylePr>
@@ -13240,9 +13276,9 @@
       </w:tcPr>
     </w:tblStylePr>
   </w:style>
-  <w:style w:type="table" w:styleId="66">
+  <w:style w:type="table" w:styleId="755">
     <w:name w:val="Grid Table 7 Colorful - Accent 5"/>
-    <w:basedOn w:val="665"/>
+    <w:basedOn w:val="887"/>
     <w:uiPriority w:val="99"/>
     <w:pPr>
       <w:pBdr/>
@@ -13344,11 +13380,11 @@
         <w:tblBorders/>
       </w:tblPr>
       <w:tcPr>
-        <w:shd w:color="ffffff"/>
+        <w:shd w:val="clear" w:color="ffffff"/>
         <w:tcBorders>
-          <w:top w:val="none"/>
-          <w:left w:val="none"/>
-          <w:bottom w:val="none"/>
+          <w:top w:val="none" w:color="000000" w:sz="4" w:space="0"/>
+          <w:left w:val="none" w:color="000000" w:sz="4" w:space="0"/>
+          <w:bottom w:val="none" w:color="000000" w:sz="4" w:space="0"/>
           <w:right w:val="single" w:color="000000" w:themeColor="accent5" w:themeTint="90" w:sz="4" w:space="0"/>
         </w:tcBorders>
       </w:tcPr>
@@ -13371,10 +13407,10 @@
       <w:tcPr>
         <w:shd w:val="clear" w:color="ffffff" w:themeColor="light1" w:fill="ffffff" w:themeFill="light1"/>
         <w:tcBorders>
-          <w:top w:val="none"/>
-          <w:left w:val="none"/>
+          <w:top w:val="none" w:color="000000" w:sz="4" w:space="0"/>
+          <w:left w:val="none" w:color="000000" w:sz="4" w:space="0"/>
           <w:bottom w:val="single" w:color="000000" w:themeColor="accent5" w:themeTint="90" w:sz="4" w:space="0"/>
-          <w:right w:val="none"/>
+          <w:right w:val="none" w:color="000000" w:sz="4" w:space="0"/>
         </w:tcBorders>
       </w:tcPr>
     </w:tblStylePr>
@@ -13394,12 +13430,12 @@
         <w:tblBorders/>
       </w:tblPr>
       <w:tcPr>
-        <w:shd w:color="ffffff"/>
+        <w:shd w:val="clear" w:color="ffffff"/>
         <w:tcBorders>
-          <w:top w:val="none"/>
+          <w:top w:val="none" w:color="000000" w:sz="4" w:space="0"/>
           <w:left w:val="single" w:color="000000" w:themeColor="accent5" w:themeTint="90" w:sz="4" w:space="0"/>
-          <w:bottom w:val="none"/>
-          <w:right w:val="none"/>
+          <w:bottom w:val="none" w:color="000000" w:sz="4" w:space="0"/>
+          <w:right w:val="none" w:color="000000" w:sz="4" w:space="0"/>
         </w:tcBorders>
       </w:tcPr>
     </w:tblStylePr>
@@ -13422,9 +13458,9 @@
         <w:shd w:val="clear" w:color="ffffff" w:themeColor="light1" w:fill="ffffff" w:themeFill="light1"/>
         <w:tcBorders>
           <w:top w:val="single" w:color="000000" w:themeColor="accent5" w:themeTint="90" w:sz="4" w:space="0"/>
-          <w:left w:val="none"/>
-          <w:bottom w:val="none"/>
-          <w:right w:val="none"/>
+          <w:left w:val="none" w:color="000000" w:sz="4" w:space="0"/>
+          <w:bottom w:val="none" w:color="000000" w:sz="4" w:space="0"/>
+          <w:right w:val="none" w:color="000000" w:sz="4" w:space="0"/>
         </w:tcBorders>
       </w:tcPr>
     </w:tblStylePr>
@@ -13494,9 +13530,9 @@
       </w:tcPr>
     </w:tblStylePr>
   </w:style>
-  <w:style w:type="table" w:styleId="67">
+  <w:style w:type="table" w:styleId="756">
     <w:name w:val="Grid Table 7 Colorful - Accent 6"/>
-    <w:basedOn w:val="665"/>
+    <w:basedOn w:val="887"/>
     <w:uiPriority w:val="99"/>
     <w:pPr>
       <w:pBdr/>
@@ -13598,11 +13634,11 @@
         <w:tblBorders/>
       </w:tblPr>
       <w:tcPr>
-        <w:shd w:color="ffffff"/>
+        <w:shd w:val="clear" w:color="ffffff"/>
         <w:tcBorders>
-          <w:top w:val="none"/>
-          <w:left w:val="none"/>
-          <w:bottom w:val="none"/>
+          <w:top w:val="none" w:color="000000" w:sz="4" w:space="0"/>
+          <w:left w:val="none" w:color="000000" w:sz="4" w:space="0"/>
+          <w:bottom w:val="none" w:color="000000" w:sz="4" w:space="0"/>
           <w:right w:val="single" w:color="000000" w:themeColor="accent6" w:themeTint="90" w:sz="4" w:space="0"/>
         </w:tcBorders>
       </w:tcPr>
@@ -13625,10 +13661,10 @@
       <w:tcPr>
         <w:shd w:val="clear" w:color="ffffff" w:themeColor="light1" w:fill="ffffff" w:themeFill="light1"/>
         <w:tcBorders>
-          <w:top w:val="none"/>
-          <w:left w:val="none"/>
+          <w:top w:val="none" w:color="000000" w:sz="4" w:space="0"/>
+          <w:left w:val="none" w:color="000000" w:sz="4" w:space="0"/>
           <w:bottom w:val="single" w:color="000000" w:themeColor="accent6" w:themeTint="90" w:sz="4" w:space="0"/>
-          <w:right w:val="none"/>
+          <w:right w:val="none" w:color="000000" w:sz="4" w:space="0"/>
         </w:tcBorders>
       </w:tcPr>
     </w:tblStylePr>
@@ -13648,12 +13684,12 @@
         <w:tblBorders/>
       </w:tblPr>
       <w:tcPr>
-        <w:shd w:color="ffffff"/>
+        <w:shd w:val="clear" w:color="ffffff"/>
         <w:tcBorders>
-          <w:top w:val="none"/>
+          <w:top w:val="none" w:color="000000" w:sz="4" w:space="0"/>
           <w:left w:val="single" w:color="000000" w:themeColor="accent6" w:themeTint="90" w:sz="4" w:space="0"/>
-          <w:bottom w:val="none"/>
-          <w:right w:val="none"/>
+          <w:bottom w:val="none" w:color="000000" w:sz="4" w:space="0"/>
+          <w:right w:val="none" w:color="000000" w:sz="4" w:space="0"/>
         </w:tcBorders>
       </w:tcPr>
     </w:tblStylePr>
@@ -13676,9 +13712,9 @@
         <w:shd w:val="clear" w:color="ffffff" w:themeColor="light1" w:fill="ffffff" w:themeFill="light1"/>
         <w:tcBorders>
           <w:top w:val="single" w:color="000000" w:themeColor="accent6" w:themeTint="90" w:sz="4" w:space="0"/>
-          <w:left w:val="none"/>
-          <w:bottom w:val="none"/>
-          <w:right w:val="none"/>
+          <w:left w:val="none" w:color="000000" w:sz="4" w:space="0"/>
+          <w:bottom w:val="none" w:color="000000" w:sz="4" w:space="0"/>
+          <w:right w:val="none" w:color="000000" w:sz="4" w:space="0"/>
         </w:tcBorders>
       </w:tcPr>
     </w:tblStylePr>
@@ -13748,9 +13784,9 @@
       </w:tcPr>
     </w:tblStylePr>
   </w:style>
-  <w:style w:type="table" w:styleId="68">
+  <w:style w:type="table" w:styleId="757">
     <w:name w:val="List Table 1 Light"/>
-    <w:basedOn w:val="665"/>
+    <w:basedOn w:val="887"/>
     <w:uiPriority w:val="99"/>
     <w:pPr>
       <w:pBdr/>
@@ -13964,9 +14000,9 @@
       </w:tcPr>
     </w:tblStylePr>
   </w:style>
-  <w:style w:type="table" w:styleId="69">
+  <w:style w:type="table" w:styleId="758">
     <w:name w:val="List Table 1 Light - Accent 1"/>
-    <w:basedOn w:val="665"/>
+    <w:basedOn w:val="887"/>
     <w:uiPriority w:val="99"/>
     <w:pPr>
       <w:pBdr/>
@@ -14180,9 +14216,9 @@
       </w:tcPr>
     </w:tblStylePr>
   </w:style>
-  <w:style w:type="table" w:styleId="70">
+  <w:style w:type="table" w:styleId="759">
     <w:name w:val="List Table 1 Light - Accent 2"/>
-    <w:basedOn w:val="665"/>
+    <w:basedOn w:val="887"/>
     <w:uiPriority w:val="99"/>
     <w:pPr>
       <w:pBdr/>
@@ -14396,9 +14432,9 @@
       </w:tcPr>
     </w:tblStylePr>
   </w:style>
-  <w:style w:type="table" w:styleId="71">
+  <w:style w:type="table" w:styleId="760">
     <w:name w:val="List Table 1 Light - Accent 3"/>
-    <w:basedOn w:val="665"/>
+    <w:basedOn w:val="887"/>
     <w:uiPriority w:val="99"/>
     <w:pPr>
       <w:pBdr/>
@@ -14612,9 +14648,9 @@
       </w:tcPr>
     </w:tblStylePr>
   </w:style>
-  <w:style w:type="table" w:styleId="72">
+  <w:style w:type="table" w:styleId="761">
     <w:name w:val="List Table 1 Light - Accent 4"/>
-    <w:basedOn w:val="665"/>
+    <w:basedOn w:val="887"/>
     <w:uiPriority w:val="99"/>
     <w:pPr>
       <w:pBdr/>
@@ -14828,9 +14864,9 @@
       </w:tcPr>
     </w:tblStylePr>
   </w:style>
-  <w:style w:type="table" w:styleId="73">
+  <w:style w:type="table" w:styleId="762">
     <w:name w:val="List Table 1 Light - Accent 5"/>
-    <w:basedOn w:val="665"/>
+    <w:basedOn w:val="887"/>
     <w:uiPriority w:val="99"/>
     <w:pPr>
       <w:pBdr/>
@@ -15044,9 +15080,9 @@
       </w:tcPr>
     </w:tblStylePr>
   </w:style>
-  <w:style w:type="table" w:styleId="74">
+  <w:style w:type="table" w:styleId="763">
     <w:name w:val="List Table 1 Light - Accent 6"/>
-    <w:basedOn w:val="665"/>
+    <w:basedOn w:val="887"/>
     <w:uiPriority w:val="99"/>
     <w:pPr>
       <w:pBdr/>
@@ -15260,9 +15296,9 @@
       </w:tcPr>
     </w:tblStylePr>
   </w:style>
-  <w:style w:type="table" w:styleId="75">
+  <w:style w:type="table" w:styleId="764">
     <w:name w:val="List Table 2"/>
-    <w:basedOn w:val="665"/>
+    <w:basedOn w:val="887"/>
     <w:uiPriority w:val="99"/>
     <w:pPr>
       <w:pBdr/>
@@ -15498,9 +15534,9 @@
       </w:tcPr>
     </w:tblStylePr>
   </w:style>
-  <w:style w:type="table" w:styleId="76">
+  <w:style w:type="table" w:styleId="765">
     <w:name w:val="List Table 2 - Accent 1"/>
-    <w:basedOn w:val="665"/>
+    <w:basedOn w:val="887"/>
     <w:uiPriority w:val="99"/>
     <w:pPr>
       <w:pBdr/>
@@ -15736,9 +15772,9 @@
       </w:tcPr>
     </w:tblStylePr>
   </w:style>
-  <w:style w:type="table" w:styleId="77">
+  <w:style w:type="table" w:styleId="766">
     <w:name w:val="List Table 2 - Accent 2"/>
-    <w:basedOn w:val="665"/>
+    <w:basedOn w:val="887"/>
     <w:uiPriority w:val="99"/>
     <w:pPr>
       <w:pBdr/>
@@ -15974,9 +16010,9 @@
       </w:tcPr>
     </w:tblStylePr>
   </w:style>
-  <w:style w:type="table" w:styleId="78">
+  <w:style w:type="table" w:styleId="767">
     <w:name w:val="List Table 2 - Accent 3"/>
-    <w:basedOn w:val="665"/>
+    <w:basedOn w:val="887"/>
     <w:uiPriority w:val="99"/>
     <w:pPr>
       <w:pBdr/>
@@ -16212,9 +16248,9 @@
       </w:tcPr>
     </w:tblStylePr>
   </w:style>
-  <w:style w:type="table" w:styleId="79">
+  <w:style w:type="table" w:styleId="768">
     <w:name w:val="List Table 2 - Accent 4"/>
-    <w:basedOn w:val="665"/>
+    <w:basedOn w:val="887"/>
     <w:uiPriority w:val="99"/>
     <w:pPr>
       <w:pBdr/>
@@ -16450,9 +16486,9 @@
       </w:tcPr>
     </w:tblStylePr>
   </w:style>
-  <w:style w:type="table" w:styleId="80">
+  <w:style w:type="table" w:styleId="769">
     <w:name w:val="List Table 2 - Accent 5"/>
-    <w:basedOn w:val="665"/>
+    <w:basedOn w:val="887"/>
     <w:uiPriority w:val="99"/>
     <w:pPr>
       <w:pBdr/>
@@ -16688,9 +16724,9 @@
       </w:tcPr>
     </w:tblStylePr>
   </w:style>
-  <w:style w:type="table" w:styleId="81">
+  <w:style w:type="table" w:styleId="770">
     <w:name w:val="List Table 2 - Accent 6"/>
-    <w:basedOn w:val="665"/>
+    <w:basedOn w:val="887"/>
     <w:uiPriority w:val="99"/>
     <w:pPr>
       <w:pBdr/>
@@ -16926,9 +16962,9 @@
       </w:tcPr>
     </w:tblStylePr>
   </w:style>
-  <w:style w:type="table" w:styleId="82">
+  <w:style w:type="table" w:styleId="771">
     <w:name w:val="List Table 3"/>
-    <w:basedOn w:val="665"/>
+    <w:basedOn w:val="887"/>
     <w:uiPriority w:val="99"/>
     <w:pPr>
       <w:pBdr/>
@@ -17154,9 +17190,9 @@
       </w:tcPr>
     </w:tblStylePr>
   </w:style>
-  <w:style w:type="table" w:styleId="83">
+  <w:style w:type="table" w:styleId="772">
     <w:name w:val="List Table 3 - Accent 1"/>
-    <w:basedOn w:val="665"/>
+    <w:basedOn w:val="887"/>
     <w:uiPriority w:val="99"/>
     <w:pPr>
       <w:pBdr/>
@@ -17382,9 +17418,9 @@
       </w:tcPr>
     </w:tblStylePr>
   </w:style>
-  <w:style w:type="table" w:styleId="84">
+  <w:style w:type="table" w:styleId="773">
     <w:name w:val="List Table 3 - Accent 2"/>
-    <w:basedOn w:val="665"/>
+    <w:basedOn w:val="887"/>
     <w:uiPriority w:val="99"/>
     <w:pPr>
       <w:pBdr/>
@@ -17610,9 +17646,9 @@
       </w:tcPr>
     </w:tblStylePr>
   </w:style>
-  <w:style w:type="table" w:styleId="85">
+  <w:style w:type="table" w:styleId="774">
     <w:name w:val="List Table 3 - Accent 3"/>
-    <w:basedOn w:val="665"/>
+    <w:basedOn w:val="887"/>
     <w:uiPriority w:val="99"/>
     <w:pPr>
       <w:pBdr/>
@@ -17838,9 +17874,9 @@
       </w:tcPr>
     </w:tblStylePr>
   </w:style>
-  <w:style w:type="table" w:styleId="86">
+  <w:style w:type="table" w:styleId="775">
     <w:name w:val="List Table 3 - Accent 4"/>
-    <w:basedOn w:val="665"/>
+    <w:basedOn w:val="887"/>
     <w:uiPriority w:val="99"/>
     <w:pPr>
       <w:pBdr/>
@@ -18066,9 +18102,9 @@
       </w:tcPr>
     </w:tblStylePr>
   </w:style>
-  <w:style w:type="table" w:styleId="87">
+  <w:style w:type="table" w:styleId="776">
     <w:name w:val="List Table 3 - Accent 5"/>
-    <w:basedOn w:val="665"/>
+    <w:basedOn w:val="887"/>
     <w:uiPriority w:val="99"/>
     <w:pPr>
       <w:pBdr/>
@@ -18294,9 +18330,9 @@
       </w:tcPr>
     </w:tblStylePr>
   </w:style>
-  <w:style w:type="table" w:styleId="88">
+  <w:style w:type="table" w:styleId="777">
     <w:name w:val="List Table 3 - Accent 6"/>
-    <w:basedOn w:val="665"/>
+    <w:basedOn w:val="887"/>
     <w:uiPriority w:val="99"/>
     <w:pPr>
       <w:pBdr/>
@@ -18522,9 +18558,9 @@
       </w:tcPr>
     </w:tblStylePr>
   </w:style>
-  <w:style w:type="table" w:styleId="89">
+  <w:style w:type="table" w:styleId="778">
     <w:name w:val="List Table 4"/>
-    <w:basedOn w:val="665"/>
+    <w:basedOn w:val="887"/>
     <w:uiPriority w:val="99"/>
     <w:pPr>
       <w:pBdr/>
@@ -18747,9 +18783,9 @@
       </w:tcPr>
     </w:tblStylePr>
   </w:style>
-  <w:style w:type="table" w:styleId="90">
+  <w:style w:type="table" w:styleId="779">
     <w:name w:val="List Table 4 - Accent 1"/>
-    <w:basedOn w:val="665"/>
+    <w:basedOn w:val="887"/>
     <w:uiPriority w:val="99"/>
     <w:pPr>
       <w:pBdr/>
@@ -18972,9 +19008,9 @@
       </w:tcPr>
     </w:tblStylePr>
   </w:style>
-  <w:style w:type="table" w:styleId="91">
+  <w:style w:type="table" w:styleId="780">
     <w:name w:val="List Table 4 - Accent 2"/>
-    <w:basedOn w:val="665"/>
+    <w:basedOn w:val="887"/>
     <w:uiPriority w:val="99"/>
     <w:pPr>
       <w:pBdr/>
@@ -19197,9 +19233,9 @@
       </w:tcPr>
     </w:tblStylePr>
   </w:style>
-  <w:style w:type="table" w:styleId="92">
+  <w:style w:type="table" w:styleId="781">
     <w:name w:val="List Table 4 - Accent 3"/>
-    <w:basedOn w:val="665"/>
+    <w:basedOn w:val="887"/>
     <w:uiPriority w:val="99"/>
     <w:pPr>
       <w:pBdr/>
@@ -19422,9 +19458,9 @@
       </w:tcPr>
     </w:tblStylePr>
   </w:style>
-  <w:style w:type="table" w:styleId="93">
+  <w:style w:type="table" w:styleId="782">
     <w:name w:val="List Table 4 - Accent 4"/>
-    <w:basedOn w:val="665"/>
+    <w:basedOn w:val="887"/>
     <w:uiPriority w:val="99"/>
     <w:pPr>
       <w:pBdr/>
@@ -19647,9 +19683,9 @@
       </w:tcPr>
     </w:tblStylePr>
   </w:style>
-  <w:style w:type="table" w:styleId="94">
+  <w:style w:type="table" w:styleId="783">
     <w:name w:val="List Table 4 - Accent 5"/>
-    <w:basedOn w:val="665"/>
+    <w:basedOn w:val="887"/>
     <w:uiPriority w:val="99"/>
     <w:pPr>
       <w:pBdr/>
@@ -19872,9 +19908,9 @@
       </w:tcPr>
     </w:tblStylePr>
   </w:style>
-  <w:style w:type="table" w:styleId="95">
+  <w:style w:type="table" w:styleId="784">
     <w:name w:val="List Table 4 - Accent 6"/>
-    <w:basedOn w:val="665"/>
+    <w:basedOn w:val="887"/>
     <w:uiPriority w:val="99"/>
     <w:pPr>
       <w:pBdr/>
@@ -20097,9 +20133,9 @@
       </w:tcPr>
     </w:tblStylePr>
   </w:style>
-  <w:style w:type="table" w:styleId="96">
+  <w:style w:type="table" w:styleId="785">
     <w:name w:val="List Table 5 Dark"/>
-    <w:basedOn w:val="665"/>
+    <w:basedOn w:val="887"/>
     <w:uiPriority w:val="99"/>
     <w:pPr>
       <w:pBdr/>
@@ -20339,9 +20375,9 @@
       </w:tcPr>
     </w:tblStylePr>
   </w:style>
-  <w:style w:type="table" w:styleId="97">
+  <w:style w:type="table" w:styleId="786">
     <w:name w:val="List Table 5 Dark - Accent 1"/>
-    <w:basedOn w:val="665"/>
+    <w:basedOn w:val="887"/>
     <w:uiPriority w:val="99"/>
     <w:pPr>
       <w:pBdr/>
@@ -20581,9 +20617,9 @@
       </w:tcPr>
     </w:tblStylePr>
   </w:style>
-  <w:style w:type="table" w:styleId="98">
+  <w:style w:type="table" w:styleId="787">
     <w:name w:val="List Table 5 Dark - Accent 2"/>
-    <w:basedOn w:val="665"/>
+    <w:basedOn w:val="887"/>
     <w:uiPriority w:val="99"/>
     <w:pPr>
       <w:pBdr/>
@@ -20823,9 +20859,9 @@
       </w:tcPr>
     </w:tblStylePr>
   </w:style>
-  <w:style w:type="table" w:styleId="99">
+  <w:style w:type="table" w:styleId="788">
     <w:name w:val="List Table 5 Dark - Accent 3"/>
-    <w:basedOn w:val="665"/>
+    <w:basedOn w:val="887"/>
     <w:uiPriority w:val="99"/>
     <w:pPr>
       <w:pBdr/>
@@ -21065,9 +21101,9 @@
       </w:tcPr>
     </w:tblStylePr>
   </w:style>
-  <w:style w:type="table" w:styleId="100">
+  <w:style w:type="table" w:styleId="789">
     <w:name w:val="List Table 5 Dark - Accent 4"/>
-    <w:basedOn w:val="665"/>
+    <w:basedOn w:val="887"/>
     <w:uiPriority w:val="99"/>
     <w:pPr>
       <w:pBdr/>
@@ -21307,9 +21343,9 @@
       </w:tcPr>
     </w:tblStylePr>
   </w:style>
-  <w:style w:type="table" w:styleId="101">
+  <w:style w:type="table" w:styleId="790">
     <w:name w:val="List Table 5 Dark - Accent 5"/>
-    <w:basedOn w:val="665"/>
+    <w:basedOn w:val="887"/>
     <w:uiPriority w:val="99"/>
     <w:pPr>
       <w:pBdr/>
@@ -21549,9 +21585,9 @@
       </w:tcPr>
     </w:tblStylePr>
   </w:style>
-  <w:style w:type="table" w:styleId="102">
+  <w:style w:type="table" w:styleId="791">
     <w:name w:val="List Table 5 Dark - Accent 6"/>
-    <w:basedOn w:val="665"/>
+    <w:basedOn w:val="887"/>
     <w:uiPriority w:val="99"/>
     <w:pPr>
       <w:pBdr/>
@@ -21791,9 +21827,9 @@
       </w:tcPr>
     </w:tblStylePr>
   </w:style>
-  <w:style w:type="table" w:styleId="103">
+  <w:style w:type="table" w:styleId="792">
     <w:name w:val="List Table 6 Colorful"/>
-    <w:basedOn w:val="665"/>
+    <w:basedOn w:val="887"/>
     <w:uiPriority w:val="99"/>
     <w:pPr>
       <w:pBdr/>
@@ -22014,9 +22050,9 @@
       </w:tcPr>
     </w:tblStylePr>
   </w:style>
-  <w:style w:type="table" w:styleId="104">
+  <w:style w:type="table" w:styleId="793">
     <w:name w:val="List Table 6 Colorful - Accent 1"/>
-    <w:basedOn w:val="665"/>
+    <w:basedOn w:val="887"/>
     <w:uiPriority w:val="99"/>
     <w:pPr>
       <w:pBdr/>
@@ -22237,9 +22273,9 @@
       </w:tcPr>
     </w:tblStylePr>
   </w:style>
-  <w:style w:type="table" w:styleId="105">
+  <w:style w:type="table" w:styleId="794">
     <w:name w:val="List Table 6 Colorful - Accent 2"/>
-    <w:basedOn w:val="665"/>
+    <w:basedOn w:val="887"/>
     <w:uiPriority w:val="99"/>
     <w:pPr>
       <w:pBdr/>
@@ -22460,9 +22496,9 @@
       </w:tcPr>
     </w:tblStylePr>
   </w:style>
-  <w:style w:type="table" w:styleId="106">
+  <w:style w:type="table" w:styleId="795">
     <w:name w:val="List Table 6 Colorful - Accent 3"/>
-    <w:basedOn w:val="665"/>
+    <w:basedOn w:val="887"/>
     <w:uiPriority w:val="99"/>
     <w:pPr>
       <w:pBdr/>
@@ -22683,9 +22719,9 @@
       </w:tcPr>
     </w:tblStylePr>
   </w:style>
-  <w:style w:type="table" w:styleId="107">
+  <w:style w:type="table" w:styleId="796">
     <w:name w:val="List Table 6 Colorful - Accent 4"/>
-    <w:basedOn w:val="665"/>
+    <w:basedOn w:val="887"/>
     <w:uiPriority w:val="99"/>
     <w:pPr>
       <w:pBdr/>
@@ -22906,9 +22942,9 @@
       </w:tcPr>
     </w:tblStylePr>
   </w:style>
-  <w:style w:type="table" w:styleId="108">
+  <w:style w:type="table" w:styleId="797">
     <w:name w:val="List Table 6 Colorful - Accent 5"/>
-    <w:basedOn w:val="665"/>
+    <w:basedOn w:val="887"/>
     <w:uiPriority w:val="99"/>
     <w:pPr>
       <w:pBdr/>
@@ -23129,9 +23165,9 @@
       </w:tcPr>
     </w:tblStylePr>
   </w:style>
-  <w:style w:type="table" w:styleId="109">
+  <w:style w:type="table" w:styleId="798">
     <w:name w:val="List Table 6 Colorful - Accent 6"/>
-    <w:basedOn w:val="665"/>
+    <w:basedOn w:val="887"/>
     <w:uiPriority w:val="99"/>
     <w:pPr>
       <w:pBdr/>
@@ -23352,9 +23388,9 @@
       </w:tcPr>
     </w:tblStylePr>
   </w:style>
-  <w:style w:type="table" w:styleId="110">
+  <w:style w:type="table" w:styleId="799">
     <w:name w:val="List Table 7 Colorful"/>
-    <w:basedOn w:val="665"/>
+    <w:basedOn w:val="887"/>
     <w:uiPriority w:val="99"/>
     <w:pPr>
       <w:pBdr/>
@@ -23453,11 +23489,11 @@
         <w:tblBorders/>
       </w:tblPr>
       <w:tcPr>
-        <w:shd w:color="ffffff"/>
+        <w:shd w:val="clear" w:color="ffffff"/>
         <w:tcBorders>
-          <w:top w:val="none"/>
-          <w:left w:val="none"/>
-          <w:bottom w:val="none"/>
+          <w:top w:val="none" w:color="000000" w:sz="4" w:space="0"/>
+          <w:left w:val="none" w:color="000000" w:sz="4" w:space="0"/>
+          <w:bottom w:val="none" w:color="000000" w:sz="4" w:space="0"/>
           <w:right w:val="single" w:color="000000" w:themeColor="text1" w:themeTint="80" w:sz="4" w:space="0"/>
         </w:tcBorders>
       </w:tcPr>
@@ -23480,10 +23516,10 @@
       <w:tcPr>
         <w:shd w:val="clear" w:color="ffffff" w:themeColor="light1" w:fill="ffffff" w:themeFill="light1"/>
         <w:tcBorders>
-          <w:top w:val="none"/>
-          <w:left w:val="none"/>
+          <w:top w:val="none" w:color="000000" w:sz="4" w:space="0"/>
+          <w:left w:val="none" w:color="000000" w:sz="4" w:space="0"/>
           <w:bottom w:val="single" w:color="000000" w:themeColor="text1" w:themeTint="80" w:sz="4" w:space="0"/>
-          <w:right w:val="none"/>
+          <w:right w:val="none" w:color="000000" w:sz="4" w:space="0"/>
         </w:tcBorders>
       </w:tcPr>
     </w:tblStylePr>
@@ -23503,12 +23539,12 @@
         <w:tblBorders/>
       </w:tblPr>
       <w:tcPr>
-        <w:shd w:color="ffffff"/>
+        <w:shd w:val="clear" w:color="ffffff"/>
         <w:tcBorders>
-          <w:top w:val="none"/>
+          <w:top w:val="none" w:color="000000" w:sz="4" w:space="0"/>
           <w:left w:val="single" w:color="000000" w:themeColor="text1" w:themeTint="80" w:sz="4" w:space="0"/>
-          <w:bottom w:val="none"/>
-          <w:right w:val="none"/>
+          <w:bottom w:val="none" w:color="000000" w:sz="4" w:space="0"/>
+          <w:right w:val="none" w:color="000000" w:sz="4" w:space="0"/>
         </w:tcBorders>
       </w:tcPr>
     </w:tblStylePr>
@@ -23531,9 +23567,9 @@
         <w:shd w:val="clear" w:color="ffffff" w:themeColor="light1" w:fill="ffffff" w:themeFill="light1"/>
         <w:tcBorders>
           <w:top w:val="single" w:color="000000" w:themeColor="text1" w:themeTint="80" w:sz="4" w:space="0"/>
-          <w:left w:val="none"/>
-          <w:bottom w:val="none"/>
-          <w:right w:val="none"/>
+          <w:left w:val="none" w:color="000000" w:sz="4" w:space="0"/>
+          <w:bottom w:val="none" w:color="000000" w:sz="4" w:space="0"/>
+          <w:right w:val="none" w:color="000000" w:sz="4" w:space="0"/>
         </w:tcBorders>
       </w:tcPr>
     </w:tblStylePr>
@@ -23608,9 +23644,9 @@
       </w:tcPr>
     </w:tblStylePr>
   </w:style>
-  <w:style w:type="table" w:styleId="111">
+  <w:style w:type="table" w:styleId="800">
     <w:name w:val="List Table 7 Colorful - Accent 1"/>
-    <w:basedOn w:val="665"/>
+    <w:basedOn w:val="887"/>
     <w:uiPriority w:val="99"/>
     <w:pPr>
       <w:pBdr/>
@@ -23709,11 +23745,11 @@
         <w:tblBorders/>
       </w:tblPr>
       <w:tcPr>
-        <w:shd w:color="ffffff"/>
+        <w:shd w:val="clear" w:color="ffffff"/>
         <w:tcBorders>
-          <w:top w:val="none"/>
-          <w:left w:val="none"/>
-          <w:bottom w:val="none"/>
+          <w:top w:val="none" w:color="000000" w:sz="4" w:space="0"/>
+          <w:left w:val="none" w:color="000000" w:sz="4" w:space="0"/>
+          <w:bottom w:val="none" w:color="000000" w:sz="4" w:space="0"/>
           <w:right w:val="single" w:color="000000" w:themeColor="accent1" w:sz="4" w:space="0"/>
         </w:tcBorders>
       </w:tcPr>
@@ -23736,10 +23772,10 @@
       <w:tcPr>
         <w:shd w:val="clear" w:color="ffffff" w:themeColor="light1" w:fill="ffffff" w:themeFill="light1"/>
         <w:tcBorders>
-          <w:top w:val="none"/>
-          <w:left w:val="none"/>
+          <w:top w:val="none" w:color="000000" w:sz="4" w:space="0"/>
+          <w:left w:val="none" w:color="000000" w:sz="4" w:space="0"/>
           <w:bottom w:val="single" w:color="000000" w:themeColor="accent1" w:sz="4" w:space="0"/>
-          <w:right w:val="none"/>
+          <w:right w:val="none" w:color="000000" w:sz="4" w:space="0"/>
         </w:tcBorders>
       </w:tcPr>
     </w:tblStylePr>
@@ -23759,12 +23795,12 @@
         <w:tblBorders/>
       </w:tblPr>
       <w:tcPr>
-        <w:shd w:color="ffffff"/>
+        <w:shd w:val="clear" w:color="ffffff"/>
         <w:tcBorders>
-          <w:top w:val="none"/>
+          <w:top w:val="none" w:color="000000" w:sz="4" w:space="0"/>
           <w:left w:val="single" w:color="000000" w:themeColor="accent1" w:sz="4" w:space="0"/>
-          <w:bottom w:val="none"/>
-          <w:right w:val="none"/>
+          <w:bottom w:val="none" w:color="000000" w:sz="4" w:space="0"/>
+          <w:right w:val="none" w:color="000000" w:sz="4" w:space="0"/>
         </w:tcBorders>
       </w:tcPr>
     </w:tblStylePr>
@@ -23787,9 +23823,9 @@
         <w:shd w:val="clear" w:color="ffffff" w:themeColor="light1" w:fill="ffffff" w:themeFill="light1"/>
         <w:tcBorders>
           <w:top w:val="single" w:color="000000" w:themeColor="accent1" w:sz="4" w:space="0"/>
-          <w:left w:val="none"/>
-          <w:bottom w:val="none"/>
-          <w:right w:val="none"/>
+          <w:left w:val="none" w:color="000000" w:sz="4" w:space="0"/>
+          <w:bottom w:val="none" w:color="000000" w:sz="4" w:space="0"/>
+          <w:right w:val="none" w:color="000000" w:sz="4" w:space="0"/>
         </w:tcBorders>
       </w:tcPr>
     </w:tblStylePr>
@@ -23864,9 +23900,9 @@
       </w:tcPr>
     </w:tblStylePr>
   </w:style>
-  <w:style w:type="table" w:styleId="112">
+  <w:style w:type="table" w:styleId="801">
     <w:name w:val="List Table 7 Colorful - Accent 2"/>
-    <w:basedOn w:val="665"/>
+    <w:basedOn w:val="887"/>
     <w:uiPriority w:val="99"/>
     <w:pPr>
       <w:pBdr/>
@@ -23965,11 +24001,11 @@
         <w:tblBorders/>
       </w:tblPr>
       <w:tcPr>
-        <w:shd w:color="ffffff"/>
+        <w:shd w:val="clear" w:color="ffffff"/>
         <w:tcBorders>
-          <w:top w:val="none"/>
-          <w:left w:val="none"/>
-          <w:bottom w:val="none"/>
+          <w:top w:val="none" w:color="000000" w:sz="4" w:space="0"/>
+          <w:left w:val="none" w:color="000000" w:sz="4" w:space="0"/>
+          <w:bottom w:val="none" w:color="000000" w:sz="4" w:space="0"/>
           <w:right w:val="single" w:color="000000" w:themeColor="accent2" w:themeTint="97" w:sz="4" w:space="0"/>
         </w:tcBorders>
       </w:tcPr>
@@ -23992,10 +24028,10 @@
       <w:tcPr>
         <w:shd w:val="clear" w:color="ffffff" w:themeColor="light1" w:fill="ffffff" w:themeFill="light1"/>
         <w:tcBorders>
-          <w:top w:val="none"/>
-          <w:left w:val="none"/>
+          <w:top w:val="none" w:color="000000" w:sz="4" w:space="0"/>
+          <w:left w:val="none" w:color="000000" w:sz="4" w:space="0"/>
           <w:bottom w:val="single" w:color="000000" w:themeColor="accent2" w:themeTint="97" w:sz="4" w:space="0"/>
-          <w:right w:val="none"/>
+          <w:right w:val="none" w:color="000000" w:sz="4" w:space="0"/>
         </w:tcBorders>
       </w:tcPr>
     </w:tblStylePr>
@@ -24015,12 +24051,12 @@
         <w:tblBorders/>
       </w:tblPr>
       <w:tcPr>
-        <w:shd w:color="ffffff"/>
+        <w:shd w:val="clear" w:color="ffffff"/>
         <w:tcBorders>
-          <w:top w:val="none"/>
+          <w:top w:val="none" w:color="000000" w:sz="4" w:space="0"/>
           <w:left w:val="single" w:color="000000" w:themeColor="accent2" w:themeTint="97" w:sz="4" w:space="0"/>
-          <w:bottom w:val="none"/>
-          <w:right w:val="none"/>
+          <w:bottom w:val="none" w:color="000000" w:sz="4" w:space="0"/>
+          <w:right w:val="none" w:color="000000" w:sz="4" w:space="0"/>
         </w:tcBorders>
       </w:tcPr>
     </w:tblStylePr>
@@ -24043,9 +24079,9 @@
         <w:shd w:val="clear" w:color="ffffff" w:themeColor="light1" w:fill="ffffff" w:themeFill="light1"/>
         <w:tcBorders>
           <w:top w:val="single" w:color="000000" w:themeColor="accent2" w:themeTint="97" w:sz="4" w:space="0"/>
-          <w:left w:val="none"/>
-          <w:bottom w:val="none"/>
-          <w:right w:val="none"/>
+          <w:left w:val="none" w:color="000000" w:sz="4" w:space="0"/>
+          <w:bottom w:val="none" w:color="000000" w:sz="4" w:space="0"/>
+          <w:right w:val="none" w:color="000000" w:sz="4" w:space="0"/>
         </w:tcBorders>
       </w:tcPr>
     </w:tblStylePr>
@@ -24120,9 +24156,9 @@
       </w:tcPr>
     </w:tblStylePr>
   </w:style>
-  <w:style w:type="table" w:styleId="113">
+  <w:style w:type="table" w:styleId="802">
     <w:name w:val="List Table 7 Colorful - Accent 3"/>
-    <w:basedOn w:val="665"/>
+    <w:basedOn w:val="887"/>
     <w:uiPriority w:val="99"/>
     <w:pPr>
       <w:pBdr/>
@@ -24221,11 +24257,11 @@
         <w:tblBorders/>
       </w:tblPr>
       <w:tcPr>
-        <w:shd w:color="ffffff"/>
+        <w:shd w:val="clear" w:color="ffffff"/>
         <w:tcBorders>
-          <w:top w:val="none"/>
-          <w:left w:val="none"/>
-          <w:bottom w:val="none"/>
+          <w:top w:val="none" w:color="000000" w:sz="4" w:space="0"/>
+          <w:left w:val="none" w:color="000000" w:sz="4" w:space="0"/>
+          <w:bottom w:val="none" w:color="000000" w:sz="4" w:space="0"/>
           <w:right w:val="single" w:color="000000" w:themeColor="accent3" w:themeTint="98" w:sz="4" w:space="0"/>
         </w:tcBorders>
       </w:tcPr>
@@ -24248,10 +24284,10 @@
       <w:tcPr>
         <w:shd w:val="clear" w:color="ffffff" w:themeColor="light1" w:fill="ffffff" w:themeFill="light1"/>
         <w:tcBorders>
-          <w:top w:val="none"/>
-          <w:left w:val="none"/>
+          <w:top w:val="none" w:color="000000" w:sz="4" w:space="0"/>
+          <w:left w:val="none" w:color="000000" w:sz="4" w:space="0"/>
           <w:bottom w:val="single" w:color="000000" w:themeColor="accent3" w:themeTint="98" w:sz="4" w:space="0"/>
-          <w:right w:val="none"/>
+          <w:right w:val="none" w:color="000000" w:sz="4" w:space="0"/>
         </w:tcBorders>
       </w:tcPr>
     </w:tblStylePr>
@@ -24271,12 +24307,12 @@
         <w:tblBorders/>
       </w:tblPr>
       <w:tcPr>
-        <w:shd w:color="ffffff"/>
+        <w:shd w:val="clear" w:color="ffffff"/>
         <w:tcBorders>
-          <w:top w:val="none"/>
+          <w:top w:val="none" w:color="000000" w:sz="4" w:space="0"/>
           <w:left w:val="single" w:color="000000" w:themeColor="accent3" w:themeTint="98" w:sz="4" w:space="0"/>
-          <w:bottom w:val="none"/>
-          <w:right w:val="none"/>
+          <w:bottom w:val="none" w:color="000000" w:sz="4" w:space="0"/>
+          <w:right w:val="none" w:color="000000" w:sz="4" w:space="0"/>
         </w:tcBorders>
       </w:tcPr>
     </w:tblStylePr>
@@ -24299,9 +24335,9 @@
         <w:shd w:val="clear" w:color="ffffff" w:themeColor="light1" w:fill="ffffff" w:themeFill="light1"/>
         <w:tcBorders>
           <w:top w:val="single" w:color="000000" w:themeColor="accent3" w:themeTint="98" w:sz="4" w:space="0"/>
-          <w:left w:val="none"/>
-          <w:bottom w:val="none"/>
-          <w:right w:val="none"/>
+          <w:left w:val="none" w:color="000000" w:sz="4" w:space="0"/>
+          <w:bottom w:val="none" w:color="000000" w:sz="4" w:space="0"/>
+          <w:right w:val="none" w:color="000000" w:sz="4" w:space="0"/>
         </w:tcBorders>
       </w:tcPr>
     </w:tblStylePr>
@@ -24376,9 +24412,9 @@
       </w:tcPr>
     </w:tblStylePr>
   </w:style>
-  <w:style w:type="table" w:styleId="114">
+  <w:style w:type="table" w:styleId="803">
     <w:name w:val="List Table 7 Colorful - Accent 4"/>
-    <w:basedOn w:val="665"/>
+    <w:basedOn w:val="887"/>
     <w:uiPriority w:val="99"/>
     <w:pPr>
       <w:pBdr/>
@@ -24477,11 +24513,11 @@
         <w:tblBorders/>
       </w:tblPr>
       <w:tcPr>
-        <w:shd w:color="ffffff"/>
+        <w:shd w:val="clear" w:color="ffffff"/>
         <w:tcBorders>
-          <w:top w:val="none"/>
-          <w:left w:val="none"/>
-          <w:bottom w:val="none"/>
+          <w:top w:val="none" w:color="000000" w:sz="4" w:space="0"/>
+          <w:left w:val="none" w:color="000000" w:sz="4" w:space="0"/>
+          <w:bottom w:val="none" w:color="000000" w:sz="4" w:space="0"/>
           <w:right w:val="single" w:color="000000" w:themeColor="accent4" w:themeTint="9A" w:sz="4" w:space="0"/>
         </w:tcBorders>
       </w:tcPr>
@@ -24504,10 +24540,10 @@
       <w:tcPr>
         <w:shd w:val="clear" w:color="ffffff" w:themeColor="light1" w:fill="ffffff" w:themeFill="light1"/>
         <w:tcBorders>
-          <w:top w:val="none"/>
-          <w:left w:val="none"/>
+          <w:top w:val="none" w:color="000000" w:sz="4" w:space="0"/>
+          <w:left w:val="none" w:color="000000" w:sz="4" w:space="0"/>
           <w:bottom w:val="single" w:color="000000" w:themeColor="accent4" w:themeTint="9A" w:sz="4" w:space="0"/>
-          <w:right w:val="none"/>
+          <w:right w:val="none" w:color="000000" w:sz="4" w:space="0"/>
         </w:tcBorders>
       </w:tcPr>
     </w:tblStylePr>
@@ -24527,12 +24563,12 @@
         <w:tblBorders/>
       </w:tblPr>
       <w:tcPr>
-        <w:shd w:color="ffffff"/>
+        <w:shd w:val="clear" w:color="ffffff"/>
         <w:tcBorders>
-          <w:top w:val="none"/>
+          <w:top w:val="none" w:color="000000" w:sz="4" w:space="0"/>
           <w:left w:val="single" w:color="000000" w:themeColor="accent4" w:themeTint="9A" w:sz="4" w:space="0"/>
-          <w:bottom w:val="none"/>
-          <w:right w:val="none"/>
+          <w:bottom w:val="none" w:color="000000" w:sz="4" w:space="0"/>
+          <w:right w:val="none" w:color="000000" w:sz="4" w:space="0"/>
         </w:tcBorders>
       </w:tcPr>
     </w:tblStylePr>
@@ -24555,9 +24591,9 @@
         <w:shd w:val="clear" w:color="ffffff" w:themeColor="light1" w:fill="ffffff" w:themeFill="light1"/>
         <w:tcBorders>
           <w:top w:val="single" w:color="000000" w:themeColor="accent4" w:themeTint="9A" w:sz="4" w:space="0"/>
-          <w:left w:val="none"/>
-          <w:bottom w:val="none"/>
-          <w:right w:val="none"/>
+          <w:left w:val="none" w:color="000000" w:sz="4" w:space="0"/>
+          <w:bottom w:val="none" w:color="000000" w:sz="4" w:space="0"/>
+          <w:right w:val="none" w:color="000000" w:sz="4" w:space="0"/>
         </w:tcBorders>
       </w:tcPr>
     </w:tblStylePr>
@@ -24632,9 +24668,9 @@
       </w:tcPr>
     </w:tblStylePr>
   </w:style>
-  <w:style w:type="table" w:styleId="115">
+  <w:style w:type="table" w:styleId="804">
     <w:name w:val="List Table 7 Colorful - Accent 5"/>
-    <w:basedOn w:val="665"/>
+    <w:basedOn w:val="887"/>
     <w:uiPriority w:val="99"/>
     <w:pPr>
       <w:pBdr/>
@@ -24733,11 +24769,11 @@
         <w:tblBorders/>
       </w:tblPr>
       <w:tcPr>
-        <w:shd w:color="ffffff"/>
+        <w:shd w:val="clear" w:color="ffffff"/>
         <w:tcBorders>
-          <w:top w:val="none"/>
-          <w:left w:val="none"/>
-          <w:bottom w:val="none"/>
+          <w:top w:val="none" w:color="000000" w:sz="4" w:space="0"/>
+          <w:left w:val="none" w:color="000000" w:sz="4" w:space="0"/>
+          <w:bottom w:val="none" w:color="000000" w:sz="4" w:space="0"/>
           <w:right w:val="single" w:color="000000" w:themeColor="accent5" w:themeTint="9A" w:sz="4" w:space="0"/>
         </w:tcBorders>
       </w:tcPr>
@@ -24760,10 +24796,10 @@
       <w:tcPr>
         <w:shd w:val="clear" w:color="ffffff" w:themeColor="light1" w:fill="ffffff" w:themeFill="light1"/>
         <w:tcBorders>
-          <w:top w:val="none"/>
-          <w:left w:val="none"/>
+          <w:top w:val="none" w:color="000000" w:sz="4" w:space="0"/>
+          <w:left w:val="none" w:color="000000" w:sz="4" w:space="0"/>
           <w:bottom w:val="single" w:color="000000" w:themeColor="accent5" w:themeTint="9A" w:sz="4" w:space="0"/>
-          <w:right w:val="none"/>
+          <w:right w:val="none" w:color="000000" w:sz="4" w:space="0"/>
         </w:tcBorders>
       </w:tcPr>
     </w:tblStylePr>
@@ -24783,12 +24819,12 @@
         <w:tblBorders/>
       </w:tblPr>
       <w:tcPr>
-        <w:shd w:color="ffffff"/>
+        <w:shd w:val="clear" w:color="ffffff"/>
         <w:tcBorders>
-          <w:top w:val="none"/>
+          <w:top w:val="none" w:color="000000" w:sz="4" w:space="0"/>
           <w:left w:val="single" w:color="000000" w:themeColor="accent5" w:themeTint="9A" w:sz="4" w:space="0"/>
-          <w:bottom w:val="none"/>
-          <w:right w:val="none"/>
+          <w:bottom w:val="none" w:color="000000" w:sz="4" w:space="0"/>
+          <w:right w:val="none" w:color="000000" w:sz="4" w:space="0"/>
         </w:tcBorders>
       </w:tcPr>
     </w:tblStylePr>
@@ -24811,9 +24847,9 @@
         <w:shd w:val="clear" w:color="ffffff" w:themeColor="light1" w:fill="ffffff" w:themeFill="light1"/>
         <w:tcBorders>
           <w:top w:val="single" w:color="000000" w:themeColor="accent5" w:themeTint="9A" w:sz="4" w:space="0"/>
-          <w:left w:val="none"/>
-          <w:bottom w:val="none"/>
-          <w:right w:val="none"/>
+          <w:left w:val="none" w:color="000000" w:sz="4" w:space="0"/>
+          <w:bottom w:val="none" w:color="000000" w:sz="4" w:space="0"/>
+          <w:right w:val="none" w:color="000000" w:sz="4" w:space="0"/>
         </w:tcBorders>
       </w:tcPr>
     </w:tblStylePr>
@@ -24888,9 +24924,9 @@
       </w:tcPr>
     </w:tblStylePr>
   </w:style>
-  <w:style w:type="table" w:styleId="116">
+  <w:style w:type="table" w:styleId="805">
     <w:name w:val="List Table 7 Colorful - Accent 6"/>
-    <w:basedOn w:val="665"/>
+    <w:basedOn w:val="887"/>
     <w:uiPriority w:val="99"/>
     <w:pPr>
       <w:pBdr/>
@@ -24989,11 +25025,11 @@
         <w:tblBorders/>
       </w:tblPr>
       <w:tcPr>
-        <w:shd w:color="ffffff"/>
+        <w:shd w:val="clear" w:color="ffffff"/>
         <w:tcBorders>
-          <w:top w:val="none"/>
-          <w:left w:val="none"/>
-          <w:bottom w:val="none"/>
+          <w:top w:val="none" w:color="000000" w:sz="4" w:space="0"/>
+          <w:left w:val="none" w:color="000000" w:sz="4" w:space="0"/>
+          <w:bottom w:val="none" w:color="000000" w:sz="4" w:space="0"/>
           <w:right w:val="single" w:color="000000" w:themeColor="accent6" w:themeTint="98" w:sz="4" w:space="0"/>
         </w:tcBorders>
       </w:tcPr>
@@ -25016,10 +25052,10 @@
       <w:tcPr>
         <w:shd w:val="clear" w:color="ffffff" w:themeColor="light1" w:fill="ffffff" w:themeFill="light1"/>
         <w:tcBorders>
-          <w:top w:val="none"/>
-          <w:left w:val="none"/>
+          <w:top w:val="none" w:color="000000" w:sz="4" w:space="0"/>
+          <w:left w:val="none" w:color="000000" w:sz="4" w:space="0"/>
           <w:bottom w:val="single" w:color="000000" w:themeColor="accent6" w:themeTint="98" w:sz="4" w:space="0"/>
-          <w:right w:val="none"/>
+          <w:right w:val="none" w:color="000000" w:sz="4" w:space="0"/>
         </w:tcBorders>
       </w:tcPr>
     </w:tblStylePr>
@@ -25039,12 +25075,12 @@
         <w:tblBorders/>
       </w:tblPr>
       <w:tcPr>
-        <w:shd w:color="ffffff"/>
+        <w:shd w:val="clear" w:color="ffffff"/>
         <w:tcBorders>
-          <w:top w:val="none"/>
+          <w:top w:val="none" w:color="000000" w:sz="4" w:space="0"/>
           <w:left w:val="single" w:color="000000" w:themeColor="accent6" w:themeTint="98" w:sz="4" w:space="0"/>
-          <w:bottom w:val="none"/>
-          <w:right w:val="none"/>
+          <w:bottom w:val="none" w:color="000000" w:sz="4" w:space="0"/>
+          <w:right w:val="none" w:color="000000" w:sz="4" w:space="0"/>
         </w:tcBorders>
       </w:tcPr>
     </w:tblStylePr>
@@ -25067,9 +25103,9 @@
         <w:shd w:val="clear" w:color="ffffff" w:themeColor="light1" w:fill="ffffff" w:themeFill="light1"/>
         <w:tcBorders>
           <w:top w:val="single" w:color="000000" w:themeColor="accent6" w:themeTint="98" w:sz="4" w:space="0"/>
-          <w:left w:val="none"/>
-          <w:bottom w:val="none"/>
-          <w:right w:val="none"/>
+          <w:left w:val="none" w:color="000000" w:sz="4" w:space="0"/>
+          <w:bottom w:val="none" w:color="000000" w:sz="4" w:space="0"/>
+          <w:right w:val="none" w:color="000000" w:sz="4" w:space="0"/>
         </w:tcBorders>
       </w:tcPr>
     </w:tblStylePr>
@@ -25144,9 +25180,9 @@
       </w:tcPr>
     </w:tblStylePr>
   </w:style>
-  <w:style w:type="table" w:styleId="117">
+  <w:style w:type="table" w:styleId="806">
     <w:name w:val="Lined - Accent"/>
-    <w:basedOn w:val="665"/>
+    <w:basedOn w:val="887"/>
     <w:uiPriority w:val="99"/>
     <w:pPr>
       <w:pBdr/>
@@ -25381,9 +25417,9 @@
       </w:tcPr>
     </w:tblStylePr>
   </w:style>
-  <w:style w:type="table" w:styleId="118">
+  <w:style w:type="table" w:styleId="807">
     <w:name w:val="Lined - Accent 1"/>
-    <w:basedOn w:val="665"/>
+    <w:basedOn w:val="887"/>
     <w:uiPriority w:val="99"/>
     <w:pPr>
       <w:pBdr/>
@@ -25618,9 +25654,9 @@
       </w:tcPr>
     </w:tblStylePr>
   </w:style>
-  <w:style w:type="table" w:styleId="119">
+  <w:style w:type="table" w:styleId="808">
     <w:name w:val="Lined - Accent 2"/>
-    <w:basedOn w:val="665"/>
+    <w:basedOn w:val="887"/>
     <w:uiPriority w:val="99"/>
     <w:pPr>
       <w:pBdr/>
@@ -25855,9 +25891,9 @@
       </w:tcPr>
     </w:tblStylePr>
   </w:style>
-  <w:style w:type="table" w:styleId="120">
+  <w:style w:type="table" w:styleId="809">
     <w:name w:val="Lined - Accent 3"/>
-    <w:basedOn w:val="665"/>
+    <w:basedOn w:val="887"/>
     <w:uiPriority w:val="99"/>
     <w:pPr>
       <w:pBdr/>
@@ -26092,9 +26128,9 @@
       </w:tcPr>
     </w:tblStylePr>
   </w:style>
-  <w:style w:type="table" w:styleId="121">
+  <w:style w:type="table" w:styleId="810">
     <w:name w:val="Lined - Accent 4"/>
-    <w:basedOn w:val="665"/>
+    <w:basedOn w:val="887"/>
     <w:uiPriority w:val="99"/>
     <w:pPr>
       <w:pBdr/>
@@ -26329,9 +26365,9 @@
       </w:tcPr>
     </w:tblStylePr>
   </w:style>
-  <w:style w:type="table" w:styleId="122">
+  <w:style w:type="table" w:styleId="811">
     <w:name w:val="Lined - Accent 5"/>
-    <w:basedOn w:val="665"/>
+    <w:basedOn w:val="887"/>
     <w:uiPriority w:val="99"/>
     <w:pPr>
       <w:pBdr/>
@@ -26566,9 +26602,9 @@
       </w:tcPr>
     </w:tblStylePr>
   </w:style>
-  <w:style w:type="table" w:styleId="123">
+  <w:style w:type="table" w:styleId="812">
     <w:name w:val="Lined - Accent 6"/>
-    <w:basedOn w:val="665"/>
+    <w:basedOn w:val="887"/>
     <w:uiPriority w:val="99"/>
     <w:pPr>
       <w:pBdr/>
@@ -26803,9 +26839,9 @@
       </w:tcPr>
     </w:tblStylePr>
   </w:style>
-  <w:style w:type="table" w:styleId="124">
+  <w:style w:type="table" w:styleId="813">
     <w:name w:val="Bordered &amp; Lined - Accent"/>
-    <w:basedOn w:val="665"/>
+    <w:basedOn w:val="887"/>
     <w:uiPriority w:val="99"/>
     <w:pPr>
       <w:pBdr/>
@@ -27047,9 +27083,9 @@
       </w:tcPr>
     </w:tblStylePr>
   </w:style>
-  <w:style w:type="table" w:styleId="125">
+  <w:style w:type="table" w:styleId="814">
     <w:name w:val="Bordered &amp; Lined - Accent 1"/>
-    <w:basedOn w:val="665"/>
+    <w:basedOn w:val="887"/>
     <w:uiPriority w:val="99"/>
     <w:pPr>
       <w:pBdr/>
@@ -27291,9 +27327,9 @@
       </w:tcPr>
     </w:tblStylePr>
   </w:style>
-  <w:style w:type="table" w:styleId="126">
+  <w:style w:type="table" w:styleId="815">
     <w:name w:val="Bordered &amp; Lined - Accent 2"/>
-    <w:basedOn w:val="665"/>
+    <w:basedOn w:val="887"/>
     <w:uiPriority w:val="99"/>
     <w:pPr>
       <w:pBdr/>
@@ -27535,9 +27571,9 @@
       </w:tcPr>
     </w:tblStylePr>
   </w:style>
-  <w:style w:type="table" w:styleId="127">
+  <w:style w:type="table" w:styleId="816">
     <w:name w:val="Bordered &amp; Lined - Accent 3"/>
-    <w:basedOn w:val="665"/>
+    <w:basedOn w:val="887"/>
     <w:uiPriority w:val="99"/>
     <w:pPr>
       <w:pBdr/>
@@ -27779,9 +27815,9 @@
       </w:tcPr>
     </w:tblStylePr>
   </w:style>
-  <w:style w:type="table" w:styleId="128">
+  <w:style w:type="table" w:styleId="817">
     <w:name w:val="Bordered &amp; Lined - Accent 4"/>
-    <w:basedOn w:val="665"/>
+    <w:basedOn w:val="887"/>
     <w:uiPriority w:val="99"/>
     <w:pPr>
       <w:pBdr/>
@@ -28023,9 +28059,9 @@
       </w:tcPr>
     </w:tblStylePr>
   </w:style>
-  <w:style w:type="table" w:styleId="129">
+  <w:style w:type="table" w:styleId="818">
     <w:name w:val="Bordered &amp; Lined - Accent 5"/>
-    <w:basedOn w:val="665"/>
+    <w:basedOn w:val="887"/>
     <w:uiPriority w:val="99"/>
     <w:pPr>
       <w:pBdr/>
@@ -28267,9 +28303,9 @@
       </w:tcPr>
     </w:tblStylePr>
   </w:style>
-  <w:style w:type="table" w:styleId="130">
+  <w:style w:type="table" w:styleId="819">
     <w:name w:val="Bordered &amp; Lined - Accent 6"/>
-    <w:basedOn w:val="665"/>
+    <w:basedOn w:val="887"/>
     <w:uiPriority w:val="99"/>
     <w:pPr>
       <w:pBdr/>
@@ -28511,9 +28547,9 @@
       </w:tcPr>
     </w:tblStylePr>
   </w:style>
-  <w:style w:type="table" w:styleId="131">
+  <w:style w:type="table" w:styleId="820">
     <w:name w:val="Bordered"/>
-    <w:basedOn w:val="665"/>
+    <w:basedOn w:val="887"/>
     <w:uiPriority w:val="99"/>
     <w:pPr>
       <w:pBdr/>
@@ -28742,9 +28778,9 @@
       </w:tcPr>
     </w:tblStylePr>
   </w:style>
-  <w:style w:type="table" w:styleId="132">
+  <w:style w:type="table" w:styleId="821">
     <w:name w:val="Bordered - Accent 1"/>
-    <w:basedOn w:val="665"/>
+    <w:basedOn w:val="887"/>
     <w:uiPriority w:val="99"/>
     <w:pPr>
       <w:pBdr/>
@@ -28973,9 +29009,9 @@
       </w:tcPr>
     </w:tblStylePr>
   </w:style>
-  <w:style w:type="table" w:styleId="133">
+  <w:style w:type="table" w:styleId="822">
     <w:name w:val="Bordered - Accent 2"/>
-    <w:basedOn w:val="665"/>
+    <w:basedOn w:val="887"/>
     <w:uiPriority w:val="99"/>
     <w:pPr>
       <w:pBdr/>
@@ -29204,9 +29240,9 @@
       </w:tcPr>
     </w:tblStylePr>
   </w:style>
-  <w:style w:type="table" w:styleId="134">
+  <w:style w:type="table" w:styleId="823">
     <w:name w:val="Bordered - Accent 3"/>
-    <w:basedOn w:val="665"/>
+    <w:basedOn w:val="887"/>
     <w:uiPriority w:val="99"/>
     <w:pPr>
       <w:pBdr/>
@@ -29435,9 +29471,9 @@
       </w:tcPr>
     </w:tblStylePr>
   </w:style>
-  <w:style w:type="table" w:styleId="135">
+  <w:style w:type="table" w:styleId="824">
     <w:name w:val="Bordered - Accent 4"/>
-    <w:basedOn w:val="665"/>
+    <w:basedOn w:val="887"/>
     <w:uiPriority w:val="99"/>
     <w:pPr>
       <w:pBdr/>
@@ -29666,9 +29702,9 @@
       </w:tcPr>
     </w:tblStylePr>
   </w:style>
-  <w:style w:type="table" w:styleId="136">
+  <w:style w:type="table" w:styleId="825">
     <w:name w:val="Bordered - Accent 5"/>
-    <w:basedOn w:val="665"/>
+    <w:basedOn w:val="887"/>
     <w:uiPriority w:val="99"/>
     <w:pPr>
       <w:pBdr/>
@@ -29897,9 +29933,9 @@
       </w:tcPr>
     </w:tblStylePr>
   </w:style>
-  <w:style w:type="table" w:styleId="137">
+  <w:style w:type="table" w:styleId="826">
     <w:name w:val="Bordered - Accent 6"/>
-    <w:basedOn w:val="665"/>
+    <w:basedOn w:val="887"/>
     <w:uiPriority w:val="99"/>
     <w:pPr>
       <w:pBdr/>
@@ -30128,11 +30164,11 @@
       </w:tcPr>
     </w:tblStylePr>
   </w:style>
-  <w:style w:type="paragraph" w:styleId="139">
+  <w:style w:type="paragraph" w:styleId="827">
     <w:name w:val="Heading 1"/>
-    <w:basedOn w:val="664"/>
-    <w:next w:val="664"/>
-    <w:link w:val="150"/>
+    <w:basedOn w:val="886"/>
+    <w:next w:val="886"/>
+    <w:link w:val="837"/>
     <w:uiPriority w:val="9"/>
     <w:qFormat/>
     <w:pPr>
@@ -30150,11 +30186,11 @@
       <w:szCs w:val="40"/>
     </w:rPr>
   </w:style>
-  <w:style w:type="paragraph" w:styleId="140">
+  <w:style w:type="paragraph" w:styleId="828">
     <w:name w:val="Heading 2"/>
-    <w:basedOn w:val="664"/>
-    <w:next w:val="664"/>
-    <w:link w:val="151"/>
+    <w:basedOn w:val="886"/>
+    <w:next w:val="886"/>
+    <w:link w:val="838"/>
     <w:uiPriority w:val="9"/>
     <w:unhideWhenUsed/>
     <w:qFormat/>
@@ -30173,11 +30209,11 @@
       <w:szCs w:val="32"/>
     </w:rPr>
   </w:style>
-  <w:style w:type="paragraph" w:styleId="141">
+  <w:style w:type="paragraph" w:styleId="829">
     <w:name w:val="Heading 3"/>
-    <w:basedOn w:val="664"/>
-    <w:next w:val="664"/>
-    <w:link w:val="152"/>
+    <w:basedOn w:val="886"/>
+    <w:next w:val="886"/>
+    <w:link w:val="839"/>
     <w:uiPriority w:val="9"/>
     <w:unhideWhenUsed/>
     <w:qFormat/>
@@ -30196,11 +30232,11 @@
       <w:szCs w:val="28"/>
     </w:rPr>
   </w:style>
-  <w:style w:type="paragraph" w:styleId="142">
+  <w:style w:type="paragraph" w:styleId="830">
     <w:name w:val="Heading 4"/>
-    <w:basedOn w:val="664"/>
-    <w:next w:val="664"/>
-    <w:link w:val="153"/>
+    <w:basedOn w:val="886"/>
+    <w:next w:val="886"/>
+    <w:link w:val="840"/>
     <w:uiPriority w:val="9"/>
     <w:unhideWhenUsed/>
     <w:qFormat/>
@@ -30219,11 +30255,11 @@
       <w:color w:val="0f4761" w:themeColor="accent1" w:themeShade="BF"/>
     </w:rPr>
   </w:style>
-  <w:style w:type="paragraph" w:styleId="143">
+  <w:style w:type="paragraph" w:styleId="831">
     <w:name w:val="Heading 5"/>
-    <w:basedOn w:val="664"/>
-    <w:next w:val="664"/>
-    <w:link w:val="154"/>
+    <w:basedOn w:val="886"/>
+    <w:next w:val="886"/>
+    <w:link w:val="841"/>
     <w:uiPriority w:val="9"/>
     <w:unhideWhenUsed/>
     <w:qFormat/>
@@ -30240,11 +30276,11 @@
       <w:color w:val="0f4761" w:themeColor="accent1" w:themeShade="BF"/>
     </w:rPr>
   </w:style>
-  <w:style w:type="paragraph" w:styleId="144">
+  <w:style w:type="paragraph" w:styleId="832">
     <w:name w:val="Heading 6"/>
-    <w:basedOn w:val="664"/>
-    <w:next w:val="664"/>
-    <w:link w:val="155"/>
+    <w:basedOn w:val="886"/>
+    <w:next w:val="886"/>
+    <w:link w:val="842"/>
     <w:uiPriority w:val="9"/>
     <w:unhideWhenUsed/>
     <w:qFormat/>
@@ -30263,11 +30299,11 @@
       <w:color w:val="595959" w:themeColor="text1" w:themeTint="A6"/>
     </w:rPr>
   </w:style>
-  <w:style w:type="paragraph" w:styleId="145">
+  <w:style w:type="paragraph" w:styleId="833">
     <w:name w:val="Heading 7"/>
-    <w:basedOn w:val="664"/>
-    <w:next w:val="664"/>
-    <w:link w:val="156"/>
+    <w:basedOn w:val="886"/>
+    <w:next w:val="886"/>
+    <w:link w:val="843"/>
     <w:uiPriority w:val="9"/>
     <w:unhideWhenUsed/>
     <w:qFormat/>
@@ -30284,11 +30320,11 @@
       <w:color w:val="595959" w:themeColor="text1" w:themeTint="A6"/>
     </w:rPr>
   </w:style>
-  <w:style w:type="paragraph" w:styleId="146">
+  <w:style w:type="paragraph" w:styleId="834">
     <w:name w:val="Heading 8"/>
-    <w:basedOn w:val="664"/>
-    <w:next w:val="664"/>
-    <w:link w:val="157"/>
+    <w:basedOn w:val="886"/>
+    <w:next w:val="886"/>
+    <w:link w:val="844"/>
     <w:uiPriority w:val="9"/>
     <w:unhideWhenUsed/>
     <w:qFormat/>
@@ -30307,11 +30343,11 @@
       <w:color w:val="272727" w:themeColor="text1" w:themeTint="D8"/>
     </w:rPr>
   </w:style>
-  <w:style w:type="paragraph" w:styleId="147">
+  <w:style w:type="paragraph" w:styleId="835">
     <w:name w:val="Heading 9"/>
-    <w:basedOn w:val="664"/>
-    <w:next w:val="664"/>
-    <w:link w:val="158"/>
+    <w:basedOn w:val="886"/>
+    <w:next w:val="886"/>
+    <w:link w:val="845"/>
     <w:uiPriority w:val="9"/>
     <w:unhideWhenUsed/>
     <w:qFormat/>
@@ -30330,7 +30366,7 @@
       <w:color w:val="272727" w:themeColor="text1" w:themeTint="D8"/>
     </w:rPr>
   </w:style>
-  <w:style w:type="character" w:styleId="148" w:default="1">
+  <w:style w:type="character" w:styleId="836" w:default="1">
     <w:name w:val="Default Paragraph Font"/>
     <w:uiPriority w:val="1"/>
     <w:semiHidden/>
@@ -30341,10 +30377,10 @@
       <w:ind/>
     </w:pPr>
   </w:style>
-  <w:style w:type="character" w:styleId="150">
+  <w:style w:type="character" w:styleId="837">
     <w:name w:val="Heading 1 Char"/>
-    <w:basedOn w:val="148"/>
-    <w:link w:val="139"/>
+    <w:basedOn w:val="836"/>
+    <w:link w:val="827"/>
     <w:uiPriority w:val="9"/>
     <w:pPr>
       <w:pBdr/>
@@ -30358,10 +30394,10 @@
       <w:szCs w:val="40"/>
     </w:rPr>
   </w:style>
-  <w:style w:type="character" w:styleId="151">
+  <w:style w:type="character" w:styleId="838">
     <w:name w:val="Heading 2 Char"/>
-    <w:basedOn w:val="148"/>
-    <w:link w:val="140"/>
+    <w:basedOn w:val="836"/>
+    <w:link w:val="828"/>
     <w:uiPriority w:val="9"/>
     <w:pPr>
       <w:pBdr/>
@@ -30375,10 +30411,10 @@
       <w:szCs w:val="32"/>
     </w:rPr>
   </w:style>
-  <w:style w:type="character" w:styleId="152">
+  <w:style w:type="character" w:styleId="839">
     <w:name w:val="Heading 3 Char"/>
-    <w:basedOn w:val="148"/>
-    <w:link w:val="141"/>
+    <w:basedOn w:val="836"/>
+    <w:link w:val="829"/>
     <w:uiPriority w:val="9"/>
     <w:pPr>
       <w:pBdr/>
@@ -30392,10 +30428,10 @@
       <w:szCs w:val="28"/>
     </w:rPr>
   </w:style>
-  <w:style w:type="character" w:styleId="153">
+  <w:style w:type="character" w:styleId="840">
     <w:name w:val="Heading 4 Char"/>
-    <w:basedOn w:val="148"/>
-    <w:link w:val="142"/>
+    <w:basedOn w:val="836"/>
+    <w:link w:val="830"/>
     <w:uiPriority w:val="9"/>
     <w:pPr>
       <w:pBdr/>
@@ -30409,10 +30445,10 @@
       <w:color w:val="0f4761" w:themeColor="accent1" w:themeShade="BF"/>
     </w:rPr>
   </w:style>
-  <w:style w:type="character" w:styleId="154">
+  <w:style w:type="character" w:styleId="841">
     <w:name w:val="Heading 5 Char"/>
-    <w:basedOn w:val="148"/>
-    <w:link w:val="143"/>
+    <w:basedOn w:val="836"/>
+    <w:link w:val="831"/>
     <w:uiPriority w:val="9"/>
     <w:pPr>
       <w:pBdr/>
@@ -30424,10 +30460,10 @@
       <w:color w:val="0f4761" w:themeColor="accent1" w:themeShade="BF"/>
     </w:rPr>
   </w:style>
-  <w:style w:type="character" w:styleId="155">
+  <w:style w:type="character" w:styleId="842">
     <w:name w:val="Heading 6 Char"/>
-    <w:basedOn w:val="148"/>
-    <w:link w:val="144"/>
+    <w:basedOn w:val="836"/>
+    <w:link w:val="832"/>
     <w:uiPriority w:val="9"/>
     <w:pPr>
       <w:pBdr/>
@@ -30441,10 +30477,10 @@
       <w:color w:val="595959" w:themeColor="text1" w:themeTint="A6"/>
     </w:rPr>
   </w:style>
-  <w:style w:type="character" w:styleId="156">
+  <w:style w:type="character" w:styleId="843">
     <w:name w:val="Heading 7 Char"/>
-    <w:basedOn w:val="148"/>
-    <w:link w:val="145"/>
+    <w:basedOn w:val="836"/>
+    <w:link w:val="833"/>
     <w:uiPriority w:val="9"/>
     <w:pPr>
       <w:pBdr/>
@@ -30456,10 +30492,10 @@
       <w:color w:val="595959" w:themeColor="text1" w:themeTint="A6"/>
     </w:rPr>
   </w:style>
-  <w:style w:type="character" w:styleId="157">
+  <w:style w:type="character" w:styleId="844">
     <w:name w:val="Heading 8 Char"/>
-    <w:basedOn w:val="148"/>
-    <w:link w:val="146"/>
+    <w:basedOn w:val="836"/>
+    <w:link w:val="834"/>
     <w:uiPriority w:val="9"/>
     <w:pPr>
       <w:pBdr/>
@@ -30473,10 +30509,10 @@
       <w:color w:val="272727" w:themeColor="text1" w:themeTint="D8"/>
     </w:rPr>
   </w:style>
-  <w:style w:type="character" w:styleId="158">
+  <w:style w:type="character" w:styleId="845">
     <w:name w:val="Heading 9 Char"/>
-    <w:basedOn w:val="148"/>
-    <w:link w:val="147"/>
+    <w:basedOn w:val="836"/>
+    <w:link w:val="835"/>
     <w:uiPriority w:val="9"/>
     <w:pPr>
       <w:pBdr/>
@@ -30490,11 +30526,11 @@
       <w:color w:val="272727" w:themeColor="text1" w:themeTint="D8"/>
     </w:rPr>
   </w:style>
-  <w:style w:type="paragraph" w:styleId="159">
+  <w:style w:type="paragraph" w:styleId="846">
     <w:name w:val="Title"/>
-    <w:basedOn w:val="664"/>
-    <w:next w:val="664"/>
-    <w:link w:val="160"/>
+    <w:basedOn w:val="886"/>
+    <w:next w:val="886"/>
+    <w:link w:val="847"/>
     <w:uiPriority w:val="10"/>
     <w:qFormat/>
     <w:pPr>
@@ -30510,10 +30546,10 @@
       <w:szCs w:val="56"/>
     </w:rPr>
   </w:style>
-  <w:style w:type="character" w:styleId="160">
+  <w:style w:type="character" w:styleId="847">
     <w:name w:val="Title Char"/>
-    <w:basedOn w:val="148"/>
-    <w:link w:val="159"/>
+    <w:basedOn w:val="836"/>
+    <w:link w:val="846"/>
     <w:uiPriority w:val="10"/>
     <w:pPr>
       <w:pBdr/>
@@ -30527,11 +30563,11 @@
       <w:szCs w:val="56"/>
     </w:rPr>
   </w:style>
-  <w:style w:type="paragraph" w:styleId="161">
+  <w:style w:type="paragraph" w:styleId="848">
     <w:name w:val="Subtitle"/>
-    <w:basedOn w:val="664"/>
-    <w:next w:val="664"/>
-    <w:link w:val="162"/>
+    <w:basedOn w:val="886"/>
+    <w:next w:val="886"/>
+    <w:link w:val="849"/>
     <w:uiPriority w:val="11"/>
     <w:qFormat/>
     <w:pPr>
@@ -30549,10 +30585,10 @@
       <w:szCs w:val="28"/>
     </w:rPr>
   </w:style>
-  <w:style w:type="character" w:styleId="162">
+  <w:style w:type="character" w:styleId="849">
     <w:name w:val="Subtitle Char"/>
-    <w:basedOn w:val="148"/>
-    <w:link w:val="161"/>
+    <w:basedOn w:val="836"/>
+    <w:link w:val="848"/>
     <w:uiPriority w:val="11"/>
     <w:pPr>
       <w:pBdr/>
@@ -30566,11 +30602,11 @@
       <w:szCs w:val="28"/>
     </w:rPr>
   </w:style>
-  <w:style w:type="paragraph" w:styleId="163">
+  <w:style w:type="paragraph" w:styleId="850">
     <w:name w:val="Quote"/>
-    <w:basedOn w:val="664"/>
-    <w:next w:val="664"/>
-    <w:link w:val="164"/>
+    <w:basedOn w:val="886"/>
+    <w:next w:val="886"/>
+    <w:link w:val="851"/>
     <w:uiPriority w:val="29"/>
     <w:qFormat/>
     <w:pPr>
@@ -30585,10 +30621,10 @@
       <w:color w:val="404040" w:themeColor="text1" w:themeTint="BF"/>
     </w:rPr>
   </w:style>
-  <w:style w:type="character" w:styleId="164">
+  <w:style w:type="character" w:styleId="851">
     <w:name w:val="Quote Char"/>
-    <w:basedOn w:val="148"/>
-    <w:link w:val="163"/>
+    <w:basedOn w:val="836"/>
+    <w:link w:val="850"/>
     <w:uiPriority w:val="29"/>
     <w:pPr>
       <w:pBdr/>
@@ -30601,9 +30637,9 @@
       <w:color w:val="404040" w:themeColor="text1" w:themeTint="BF"/>
     </w:rPr>
   </w:style>
-  <w:style w:type="character" w:styleId="166">
+  <w:style w:type="character" w:styleId="852">
     <w:name w:val="Intense Emphasis"/>
-    <w:basedOn w:val="148"/>
+    <w:basedOn w:val="836"/>
     <w:uiPriority w:val="21"/>
     <w:qFormat/>
     <w:pPr>
@@ -30617,11 +30653,11 @@
       <w:color w:val="0f4761" w:themeColor="accent1" w:themeShade="BF"/>
     </w:rPr>
   </w:style>
-  <w:style w:type="paragraph" w:styleId="167">
+  <w:style w:type="paragraph" w:styleId="853">
     <w:name w:val="Intense Quote"/>
-    <w:basedOn w:val="664"/>
-    <w:next w:val="664"/>
-    <w:link w:val="168"/>
+    <w:basedOn w:val="886"/>
+    <w:next w:val="886"/>
+    <w:link w:val="854"/>
     <w:uiPriority w:val="30"/>
     <w:qFormat/>
     <w:pPr>
@@ -30639,10 +30675,10 @@
       <w:color w:val="0f4761" w:themeColor="accent1" w:themeShade="BF"/>
     </w:rPr>
   </w:style>
-  <w:style w:type="character" w:styleId="168">
+  <w:style w:type="character" w:styleId="854">
     <w:name w:val="Intense Quote Char"/>
-    <w:basedOn w:val="148"/>
-    <w:link w:val="167"/>
+    <w:basedOn w:val="836"/>
+    <w:link w:val="853"/>
     <w:uiPriority w:val="30"/>
     <w:pPr>
       <w:pBdr/>
@@ -30655,9 +30691,9 @@
       <w:color w:val="0f4761" w:themeColor="accent1" w:themeShade="BF"/>
     </w:rPr>
   </w:style>
-  <w:style w:type="character" w:styleId="169">
+  <w:style w:type="character" w:styleId="855">
     <w:name w:val="Intense Reference"/>
-    <w:basedOn w:val="148"/>
+    <w:basedOn w:val="836"/>
     <w:uiPriority w:val="32"/>
     <w:qFormat/>
     <w:pPr>
@@ -30673,9 +30709,9 @@
       <w:spacing w:val="5"/>
     </w:rPr>
   </w:style>
-  <w:style w:type="character" w:styleId="171">
+  <w:style w:type="character" w:styleId="856">
     <w:name w:val="Subtle Emphasis"/>
-    <w:basedOn w:val="148"/>
+    <w:basedOn w:val="836"/>
     <w:uiPriority w:val="19"/>
     <w:qFormat/>
     <w:pPr>
@@ -30689,9 +30725,9 @@
       <w:color w:val="404040" w:themeColor="text1" w:themeTint="BF"/>
     </w:rPr>
   </w:style>
-  <w:style w:type="character" w:styleId="172">
+  <w:style w:type="character" w:styleId="857">
     <w:name w:val="Emphasis"/>
-    <w:basedOn w:val="148"/>
+    <w:basedOn w:val="836"/>
     <w:uiPriority w:val="20"/>
     <w:qFormat/>
     <w:pPr>
@@ -30704,9 +30740,9 @@
       <w:iCs/>
     </w:rPr>
   </w:style>
-  <w:style w:type="character" w:styleId="173">
+  <w:style w:type="character" w:styleId="858">
     <w:name w:val="Strong"/>
-    <w:basedOn w:val="148"/>
+    <w:basedOn w:val="836"/>
     <w:uiPriority w:val="22"/>
     <w:qFormat/>
     <w:pPr>
@@ -30719,9 +30755,9 @@
       <w:bCs/>
     </w:rPr>
   </w:style>
-  <w:style w:type="character" w:styleId="174">
+  <w:style w:type="character" w:styleId="859">
     <w:name w:val="Subtle Reference"/>
-    <w:basedOn w:val="148"/>
+    <w:basedOn w:val="836"/>
     <w:uiPriority w:val="31"/>
     <w:qFormat/>
     <w:pPr>
@@ -30734,9 +30770,9 @@
       <w:color w:val="5a5a5a" w:themeColor="text1" w:themeTint="A5"/>
     </w:rPr>
   </w:style>
-  <w:style w:type="character" w:styleId="175">
+  <w:style w:type="character" w:styleId="860">
     <w:name w:val="Book Title"/>
-    <w:basedOn w:val="148"/>
+    <w:basedOn w:val="836"/>
     <w:uiPriority w:val="33"/>
     <w:qFormat/>
     <w:pPr>
@@ -30752,10 +30788,10 @@
       <w:spacing w:val="5"/>
     </w:rPr>
   </w:style>
-  <w:style w:type="paragraph" w:styleId="176">
+  <w:style w:type="paragraph" w:styleId="861">
     <w:name w:val="Header"/>
-    <w:basedOn w:val="664"/>
-    <w:link w:val="177"/>
+    <w:basedOn w:val="886"/>
+    <w:link w:val="862"/>
     <w:uiPriority w:val="99"/>
     <w:unhideWhenUsed/>
     <w:pPr>
@@ -30768,10 +30804,10 @@
       <w:ind/>
     </w:pPr>
   </w:style>
-  <w:style w:type="character" w:styleId="177">
+  <w:style w:type="character" w:styleId="862">
     <w:name w:val="Header Char"/>
-    <w:basedOn w:val="148"/>
-    <w:link w:val="176"/>
+    <w:basedOn w:val="836"/>
+    <w:link w:val="861"/>
     <w:uiPriority w:val="99"/>
     <w:pPr>
       <w:pBdr/>
@@ -30779,10 +30815,10 @@
       <w:ind/>
     </w:pPr>
   </w:style>
-  <w:style w:type="paragraph" w:styleId="178">
+  <w:style w:type="paragraph" w:styleId="863">
     <w:name w:val="Footer"/>
-    <w:basedOn w:val="664"/>
-    <w:link w:val="179"/>
+    <w:basedOn w:val="886"/>
+    <w:link w:val="864"/>
     <w:uiPriority w:val="99"/>
     <w:unhideWhenUsed/>
     <w:pPr>
@@ -30795,10 +30831,10 @@
       <w:ind/>
     </w:pPr>
   </w:style>
-  <w:style w:type="character" w:styleId="179">
+  <w:style w:type="character" w:styleId="864">
     <w:name w:val="Footer Char"/>
-    <w:basedOn w:val="148"/>
-    <w:link w:val="178"/>
+    <w:basedOn w:val="836"/>
+    <w:link w:val="863"/>
     <w:uiPriority w:val="99"/>
     <w:pPr>
       <w:pBdr/>
@@ -30806,10 +30842,10 @@
       <w:ind/>
     </w:pPr>
   </w:style>
-  <w:style w:type="paragraph" w:styleId="180">
+  <w:style w:type="paragraph" w:styleId="865">
     <w:name w:val="Caption"/>
-    <w:basedOn w:val="664"/>
-    <w:next w:val="664"/>
+    <w:basedOn w:val="886"/>
+    <w:next w:val="886"/>
     <w:uiPriority w:val="35"/>
     <w:unhideWhenUsed/>
     <w:qFormat/>
@@ -30826,10 +30862,10 @@
       <w:szCs w:val="18"/>
     </w:rPr>
   </w:style>
-  <w:style w:type="paragraph" w:styleId="181">
+  <w:style w:type="paragraph" w:styleId="866">
     <w:name w:val="footnote text"/>
-    <w:basedOn w:val="664"/>
-    <w:link w:val="182"/>
+    <w:basedOn w:val="886"/>
+    <w:link w:val="867"/>
     <w:uiPriority w:val="99"/>
     <w:semiHidden/>
     <w:unhideWhenUsed/>
@@ -30843,10 +30879,10 @@
       <w:szCs w:val="20"/>
     </w:rPr>
   </w:style>
-  <w:style w:type="character" w:styleId="182">
+  <w:style w:type="character" w:styleId="867">
     <w:name w:val="Footnote Text Char"/>
-    <w:basedOn w:val="148"/>
-    <w:link w:val="181"/>
+    <w:basedOn w:val="836"/>
+    <w:link w:val="866"/>
     <w:uiPriority w:val="99"/>
     <w:semiHidden/>
     <w:pPr>
@@ -30859,9 +30895,9 @@
       <w:szCs w:val="20"/>
     </w:rPr>
   </w:style>
-  <w:style w:type="character" w:styleId="183">
+  <w:style w:type="character" w:styleId="868">
     <w:name w:val="footnote reference"/>
-    <w:basedOn w:val="148"/>
+    <w:basedOn w:val="836"/>
     <w:uiPriority w:val="99"/>
     <w:semiHidden/>
     <w:unhideWhenUsed/>
@@ -30874,10 +30910,10 @@
       <w:vertAlign w:val="superscript"/>
     </w:rPr>
   </w:style>
-  <w:style w:type="paragraph" w:styleId="184">
+  <w:style w:type="paragraph" w:styleId="869">
     <w:name w:val="endnote text"/>
-    <w:basedOn w:val="664"/>
-    <w:link w:val="185"/>
+    <w:basedOn w:val="886"/>
+    <w:link w:val="870"/>
     <w:uiPriority w:val="99"/>
     <w:semiHidden/>
     <w:unhideWhenUsed/>
@@ -30891,10 +30927,10 @@
       <w:szCs w:val="20"/>
     </w:rPr>
   </w:style>
-  <w:style w:type="character" w:styleId="185">
+  <w:style w:type="character" w:styleId="870">
     <w:name w:val="Endnote Text Char"/>
-    <w:basedOn w:val="148"/>
-    <w:link w:val="184"/>
+    <w:basedOn w:val="836"/>
+    <w:link w:val="869"/>
     <w:uiPriority w:val="99"/>
     <w:semiHidden/>
     <w:pPr>
@@ -30907,9 +30943,9 @@
       <w:szCs w:val="20"/>
     </w:rPr>
   </w:style>
-  <w:style w:type="character" w:styleId="186">
+  <w:style w:type="character" w:styleId="871">
     <w:name w:val="endnote reference"/>
-    <w:basedOn w:val="148"/>
+    <w:basedOn w:val="836"/>
     <w:uiPriority w:val="99"/>
     <w:semiHidden/>
     <w:unhideWhenUsed/>
@@ -30922,9 +30958,9 @@
       <w:vertAlign w:val="superscript"/>
     </w:rPr>
   </w:style>
-  <w:style w:type="character" w:styleId="187">
+  <w:style w:type="character" w:styleId="872">
     <w:name w:val="Hyperlink"/>
-    <w:basedOn w:val="148"/>
+    <w:basedOn w:val="836"/>
     <w:uiPriority w:val="99"/>
     <w:unhideWhenUsed/>
     <w:pPr>
@@ -30937,9 +30973,9 @@
       <w:u w:val="single"/>
     </w:rPr>
   </w:style>
-  <w:style w:type="character" w:styleId="188">
+  <w:style w:type="character" w:styleId="873">
     <w:name w:val="FollowedHyperlink"/>
-    <w:basedOn w:val="148"/>
+    <w:basedOn w:val="836"/>
     <w:uiPriority w:val="99"/>
     <w:semiHidden/>
     <w:unhideWhenUsed/>
@@ -30953,10 +30989,10 @@
       <w:u w:val="single"/>
     </w:rPr>
   </w:style>
-  <w:style w:type="paragraph" w:styleId="189">
+  <w:style w:type="paragraph" w:styleId="874">
     <w:name w:val="toc 1"/>
-    <w:basedOn w:val="664"/>
-    <w:next w:val="664"/>
+    <w:basedOn w:val="886"/>
+    <w:next w:val="886"/>
     <w:uiPriority w:val="39"/>
     <w:unhideWhenUsed/>
     <w:pPr>
@@ -30965,10 +31001,10 @@
       <w:ind/>
     </w:pPr>
   </w:style>
-  <w:style w:type="paragraph" w:styleId="190">
+  <w:style w:type="paragraph" w:styleId="875">
     <w:name w:val="toc 2"/>
-    <w:basedOn w:val="664"/>
-    <w:next w:val="664"/>
+    <w:basedOn w:val="886"/>
+    <w:next w:val="886"/>
     <w:uiPriority w:val="39"/>
     <w:unhideWhenUsed/>
     <w:pPr>
@@ -30977,10 +31013,10 @@
       <w:ind w:left="220"/>
     </w:pPr>
   </w:style>
-  <w:style w:type="paragraph" w:styleId="191">
+  <w:style w:type="paragraph" w:styleId="876">
     <w:name w:val="toc 3"/>
-    <w:basedOn w:val="664"/>
-    <w:next w:val="664"/>
+    <w:basedOn w:val="886"/>
+    <w:next w:val="886"/>
     <w:uiPriority w:val="39"/>
     <w:unhideWhenUsed/>
     <w:pPr>
@@ -30989,10 +31025,10 @@
       <w:ind w:left="440"/>
     </w:pPr>
   </w:style>
-  <w:style w:type="paragraph" w:styleId="192">
+  <w:style w:type="paragraph" w:styleId="877">
     <w:name w:val="toc 4"/>
-    <w:basedOn w:val="664"/>
-    <w:next w:val="664"/>
+    <w:basedOn w:val="886"/>
+    <w:next w:val="886"/>
     <w:uiPriority w:val="39"/>
     <w:unhideWhenUsed/>
     <w:pPr>
@@ -31001,10 +31037,10 @@
       <w:ind w:left="660"/>
     </w:pPr>
   </w:style>
-  <w:style w:type="paragraph" w:styleId="193">
+  <w:style w:type="paragraph" w:styleId="878">
     <w:name w:val="toc 5"/>
-    <w:basedOn w:val="664"/>
-    <w:next w:val="664"/>
+    <w:basedOn w:val="886"/>
+    <w:next w:val="886"/>
     <w:uiPriority w:val="39"/>
     <w:unhideWhenUsed/>
     <w:pPr>
@@ -31013,10 +31049,10 @@
       <w:ind w:left="880"/>
     </w:pPr>
   </w:style>
-  <w:style w:type="paragraph" w:styleId="194">
+  <w:style w:type="paragraph" w:styleId="879">
     <w:name w:val="toc 6"/>
-    <w:basedOn w:val="664"/>
-    <w:next w:val="664"/>
+    <w:basedOn w:val="886"/>
+    <w:next w:val="886"/>
     <w:uiPriority w:val="39"/>
     <w:unhideWhenUsed/>
     <w:pPr>
@@ -31025,10 +31061,10 @@
       <w:ind w:left="1100"/>
     </w:pPr>
   </w:style>
-  <w:style w:type="paragraph" w:styleId="195">
+  <w:style w:type="paragraph" w:styleId="880">
     <w:name w:val="toc 7"/>
-    <w:basedOn w:val="664"/>
-    <w:next w:val="664"/>
+    <w:basedOn w:val="886"/>
+    <w:next w:val="886"/>
     <w:uiPriority w:val="39"/>
     <w:unhideWhenUsed/>
     <w:pPr>
@@ -31037,10 +31073,10 @@
       <w:ind w:left="1320"/>
     </w:pPr>
   </w:style>
-  <w:style w:type="paragraph" w:styleId="196">
+  <w:style w:type="paragraph" w:styleId="881">
     <w:name w:val="toc 8"/>
-    <w:basedOn w:val="664"/>
-    <w:next w:val="664"/>
+    <w:basedOn w:val="886"/>
+    <w:next w:val="886"/>
     <w:uiPriority w:val="39"/>
     <w:unhideWhenUsed/>
     <w:pPr>
@@ -31049,10 +31085,10 @@
       <w:ind w:left="1540"/>
     </w:pPr>
   </w:style>
-  <w:style w:type="paragraph" w:styleId="197">
+  <w:style w:type="paragraph" w:styleId="882">
     <w:name w:val="toc 9"/>
-    <w:basedOn w:val="664"/>
-    <w:next w:val="664"/>
+    <w:basedOn w:val="886"/>
+    <w:next w:val="886"/>
     <w:uiPriority w:val="39"/>
     <w:unhideWhenUsed/>
     <w:pPr>
@@ -31061,9 +31097,9 @@
       <w:ind w:left="1760"/>
     </w:pPr>
   </w:style>
-  <w:style w:type="character" w:styleId="198">
+  <w:style w:type="character" w:styleId="883">
     <w:name w:val="Placeholder Text"/>
-    <w:basedOn w:val="148"/>
+    <w:basedOn w:val="836"/>
     <w:uiPriority w:val="99"/>
     <w:semiHidden/>
     <w:pPr>
@@ -31075,7 +31111,7 @@
       <w:color w:val="666666"/>
     </w:rPr>
   </w:style>
-  <w:style w:type="paragraph" w:styleId="208">
+  <w:style w:type="paragraph" w:styleId="884">
     <w:name w:val="TOC Heading"/>
     <w:uiPriority w:val="39"/>
     <w:unhideWhenUsed/>
@@ -31085,10 +31121,10 @@
       <w:ind/>
     </w:pPr>
   </w:style>
-  <w:style w:type="paragraph" w:styleId="209">
+  <w:style w:type="paragraph" w:styleId="885">
     <w:name w:val="table of figures"/>
-    <w:basedOn w:val="664"/>
-    <w:next w:val="664"/>
+    <w:basedOn w:val="886"/>
+    <w:next w:val="886"/>
     <w:uiPriority w:val="99"/>
     <w:unhideWhenUsed/>
     <w:pPr>
@@ -31097,7 +31133,7 @@
       <w:ind/>
     </w:pPr>
   </w:style>
-  <w:style w:type="paragraph" w:styleId="664" w:default="1">
+  <w:style w:type="paragraph" w:styleId="886" w:default="1">
     <w:name w:val="Normal"/>
     <w:qFormat/>
     <w:pPr>
@@ -31106,7 +31142,7 @@
       <w:ind/>
     </w:pPr>
   </w:style>
-  <w:style w:type="table" w:styleId="665" w:default="1">
+  <w:style w:type="table" w:styleId="887" w:default="1">
     <w:name w:val="Normal Table"/>
     <w:uiPriority w:val="99"/>
     <w:semiHidden/>
@@ -31299,7 +31335,7 @@
       </w:tcPr>
     </w:tblStylePr>
   </w:style>
-  <w:style w:type="numbering" w:styleId="666" w:default="1">
+  <w:style w:type="numbering" w:styleId="888" w:default="1">
     <w:name w:val="No List"/>
     <w:uiPriority w:val="99"/>
     <w:semiHidden/>
@@ -31310,9 +31346,9 @@
       <w:ind/>
     </w:pPr>
   </w:style>
-  <w:style w:type="paragraph" w:styleId="667">
+  <w:style w:type="paragraph" w:styleId="889">
     <w:name w:val="No Spacing"/>
-    <w:basedOn w:val="664"/>
+    <w:basedOn w:val="886"/>
     <w:uiPriority w:val="1"/>
     <w:qFormat/>
     <w:pPr>
@@ -31321,9 +31357,9 @@
       <w:ind/>
     </w:pPr>
   </w:style>
-  <w:style w:type="paragraph" w:styleId="668">
+  <w:style w:type="paragraph" w:styleId="890">
     <w:name w:val="List Paragraph"/>
-    <w:basedOn w:val="664"/>
+    <w:basedOn w:val="886"/>
     <w:uiPriority w:val="34"/>
     <w:qFormat/>
     <w:pPr>

</xml_diff>